<commit_message>
Add gratitude lesson and illustrate teaching materials
</commit_message>
<xml_diff>
--- a/assets/lessons/chto-delat-so-svoim-talantom/Talant_Razdatka.docx
+++ b/assets/lessons/chto-delat-so-svoim-talantom/Talant_Razdatka.docx
@@ -15,11 +15,78 @@
         <w:t>Имя по желанию: ______________________   Дата: ____________________</w:t>
       </w:r>
     </w:p>
-    <w:p>
-      <w:r>
-        <w:t>Заполняйте первые две строки на этапе 6, план — на этапе 10, последнюю строку — на этапе 11. Лист остаётся у участника.</w:t>
-      </w:r>
-    </w:p>
+    <w:tbl>
+      <w:tblPr>
+        <w:tblW w:type="auto" w:w="0"/>
+        <w:tblLayout w:type="fixed"/>
+        <w:tblLook w:firstColumn="1" w:firstRow="1" w:lastColumn="0" w:lastRow="0" w:noHBand="0" w:noVBand="1" w:val="04A0"/>
+      </w:tblPr>
+      <w:tblGrid>
+        <w:gridCol w:w="2088"/>
+        <w:gridCol w:w="7992"/>
+      </w:tblGrid>
+      <w:tr>
+        <w:trPr>
+          <w:cantSplit/>
+        </w:trPr>
+        <w:tc>
+          <w:tcPr>
+            <w:tcW w:type="dxa" w:w="2088"/>
+            <w:vAlign w:val="center"/>
+          </w:tcPr>
+          <w:p>
+            <w:pPr>
+              <w:spacing w:after="40"/>
+            </w:pPr>
+            <w:r>
+              <w:drawing>
+                <wp:inline xmlns:a="http://schemas.openxmlformats.org/drawingml/2006/main" xmlns:pic="http://schemas.openxmlformats.org/drawingml/2006/picture">
+                  <wp:extent cx="1143000" cy="643279"/>
+                  <wp:docPr id="1" name="Picture 1" descr="Разные возможности"/>
+                  <wp:cNvGraphicFramePr>
+                    <a:graphicFrameLocks noChangeAspect="1"/>
+                  </wp:cNvGraphicFramePr>
+                  <a:graphic>
+                    <a:graphicData uri="http://schemas.openxmlformats.org/drawingml/2006/picture">
+                      <pic:pic>
+                        <pic:nvPicPr>
+                          <pic:cNvPr id="0" name="01.jpg"/>
+                          <pic:cNvPicPr/>
+                        </pic:nvPicPr>
+                        <pic:blipFill>
+                          <a:blip r:embed="rId10"/>
+                          <a:stretch>
+                            <a:fillRect/>
+                          </a:stretch>
+                        </pic:blipFill>
+                        <pic:spPr>
+                          <a:xfrm>
+                            <a:off x="0" y="0"/>
+                            <a:ext cx="1143000" cy="643279"/>
+                          </a:xfrm>
+                          <a:prstGeom prst="rect"/>
+                        </pic:spPr>
+                      </pic:pic>
+                    </a:graphicData>
+                  </a:graphic>
+                </wp:inline>
+              </w:drawing>
+            </w:r>
+          </w:p>
+        </w:tc>
+        <w:tc>
+          <w:tcPr>
+            <w:tcW w:type="dxa" w:w="7992"/>
+            <w:vAlign w:val="center"/>
+          </w:tcPr>
+          <w:p>
+            <w:r>
+              <w:t>Первые две строки — на этапе 6, план — на этапе 10, последняя — на этапе 11. Лист остаётся у участника.</w:t>
+            </w:r>
+          </w:p>
+        </w:tc>
+      </w:tr>
+    </w:tbl>
     <w:p>
       <w:r>
         <w:t>У меня уже получается…</w:t>
@@ -139,92 +206,922 @@
     </w:p>
     <w:p>
       <w:r>
-        <w:t>Вырежьте шесть карточек с числами. Хозяин раздаёт первые три. Первые двое слуг показывают результат, третий возвращает прежнюю карточку из конверта. Итоги относятся к моменту отчёта до решения хозяина.</w:t>
+        <w:t>Вырежьте шесть карточек с числами. Хозяин раздаёт первые три. Первые двое показывают результат, третий возвращает прежнюю карточку из конверта. Итоги — в момент отчёта до решения хозяина.</w:t>
       </w:r>
     </w:p>
-    <w:p>
-      <w:pPr>
-        <w:spacing w:before="300"/>
-      </w:pPr>
-      <w:r>
-        <w:rPr>
-          <w:b/>
-          <w:sz w:val="44"/>
-        </w:rPr>
-        <w:t>Получил 5 талантов</w:t>
-      </w:r>
-    </w:p>
-    <w:p>
-      <w:pPr>
-        <w:spacing w:before="300"/>
-      </w:pPr>
-      <w:r>
-        <w:rPr>
-          <w:b/>
-          <w:sz w:val="44"/>
-        </w:rPr>
-        <w:t>Получил 2 таланта</w:t>
-      </w:r>
-    </w:p>
-    <w:p>
-      <w:pPr>
-        <w:spacing w:before="300"/>
-      </w:pPr>
-      <w:r>
-        <w:rPr>
-          <w:b/>
-          <w:sz w:val="44"/>
-        </w:rPr>
-        <w:t>Получил 1 талант</w:t>
-      </w:r>
-    </w:p>
-    <w:p>
-      <w:pPr>
-        <w:spacing w:before="300"/>
-      </w:pPr>
-      <w:r>
-        <w:rPr>
-          <w:b/>
-          <w:sz w:val="44"/>
-        </w:rPr>
-        <w:t>Всего 10 талантов</w:t>
-      </w:r>
-    </w:p>
-    <w:p>
-      <w:pPr>
-        <w:spacing w:before="300"/>
-      </w:pPr>
-      <w:r>
-        <w:rPr>
-          <w:b/>
-          <w:sz w:val="44"/>
-        </w:rPr>
-        <w:t>Всего 4 таланта</w:t>
-      </w:r>
-    </w:p>
-    <w:p>
-      <w:pPr>
-        <w:spacing w:before="300"/>
-      </w:pPr>
-      <w:r>
-        <w:rPr>
-          <w:b/>
-          <w:sz w:val="44"/>
-        </w:rPr>
-        <w:t>Всего 1 талант</w:t>
-      </w:r>
-    </w:p>
-    <w:p>
-      <w:pPr>
-        <w:spacing w:before="400"/>
-      </w:pPr>
-      <w:r>
-        <w:t>ИСПОЛЬЗОВАЛ     /     СПРЯТАЛ</w:t>
-      </w:r>
-    </w:p>
+    <w:tbl>
+      <w:tblPr>
+        <w:tblW w:type="auto" w:w="0"/>
+        <w:tblLayout w:type="fixed"/>
+        <w:tblLook w:firstColumn="1" w:firstRow="1" w:lastColumn="0" w:lastRow="0" w:noHBand="0" w:noVBand="1" w:val="04A0"/>
+      </w:tblPr>
+      <w:tblGrid>
+        <w:gridCol w:w="5040"/>
+        <w:gridCol w:w="5040"/>
+      </w:tblGrid>
+      <w:tr>
+        <w:trPr>
+          <w:cantSplit/>
+        </w:trPr>
+        <w:tc>
+          <w:tcPr>
+            <w:tcW w:type="dxa" w:w="5040"/>
+            <w:vAlign w:val="center"/>
+            <w:tcBorders>
+              <w:top w:val="dashed" w:sz="4" w:color="8C8C8C"/>
+              <w:left w:val="dashed" w:sz="4" w:color="8C8C8C"/>
+              <w:bottom w:val="dashed" w:sz="4" w:color="8C8C8C"/>
+              <w:right w:val="dashed" w:sz="4" w:color="8C8C8C"/>
+            </w:tcBorders>
+          </w:tcPr>
+          <w:p>
+            <w:pPr>
+              <w:spacing w:after="0" w:line="20" w:lineRule="exact"/>
+            </w:pPr>
+            <w:r>
+              <w:rPr>
+                <w:sz w:val="2"/>
+              </w:rPr>
+            </w:r>
+          </w:p>
+          <w:tbl>
+            <w:tblPr>
+              <w:tblW w:type="auto" w:w="0"/>
+              <w:tblLayout w:type="fixed"/>
+              <w:tblLook w:firstColumn="1" w:firstRow="1" w:lastColumn="0" w:lastRow="0" w:noHBand="0" w:noVBand="1" w:val="04A0"/>
+            </w:tblPr>
+            <w:tblGrid>
+              <w:gridCol w:w="1584"/>
+              <w:gridCol w:w="3024"/>
+            </w:tblGrid>
+            <w:tr>
+              <w:tc>
+                <w:tcPr>
+                  <w:tcW w:type="dxa" w:w="1584"/>
+                  <w:vAlign w:val="center"/>
+                </w:tcPr>
+                <w:p>
+                  <w:pPr>
+                    <w:spacing w:after="40"/>
+                  </w:pPr>
+                  <w:r>
+                    <w:drawing>
+                      <wp:inline xmlns:a="http://schemas.openxmlformats.org/drawingml/2006/main" xmlns:pic="http://schemas.openxmlformats.org/drawingml/2006/picture">
+                        <wp:extent cx="868680" cy="488892"/>
+                        <wp:docPr id="2" name="Picture 2" descr="Иллюстрация по теме карточки"/>
+                        <wp:cNvGraphicFramePr>
+                          <a:graphicFrameLocks noChangeAspect="1"/>
+                        </wp:cNvGraphicFramePr>
+                        <a:graphic>
+                          <a:graphicData uri="http://schemas.openxmlformats.org/drawingml/2006/picture">
+                            <pic:pic>
+                              <pic:nvPicPr>
+                                <pic:cNvPr id="0" name="02.jpg"/>
+                                <pic:cNvPicPr/>
+                              </pic:nvPicPr>
+                              <pic:blipFill>
+                                <a:blip r:embed="rId11"/>
+                                <a:stretch>
+                                  <a:fillRect/>
+                                </a:stretch>
+                              </pic:blipFill>
+                              <pic:spPr>
+                                <a:xfrm>
+                                  <a:off x="0" y="0"/>
+                                  <a:ext cx="868680" cy="488892"/>
+                                </a:xfrm>
+                                <a:prstGeom prst="rect"/>
+                              </pic:spPr>
+                            </pic:pic>
+                          </a:graphicData>
+                        </a:graphic>
+                      </wp:inline>
+                    </w:drawing>
+                  </w:r>
+                </w:p>
+              </w:tc>
+              <w:tc>
+                <w:tcPr>
+                  <w:tcW w:type="dxa" w:w="3024"/>
+                  <w:vAlign w:val="center"/>
+                </w:tcPr>
+                <w:p>
+                  <w:pPr>
+                    <w:spacing w:after="40" w:line="240" w:lineRule="auto"/>
+                  </w:pPr>
+                  <w:r>
+                    <w:rPr>
+                      <w:sz w:val="38"/>
+                    </w:rPr>
+                    <w:t>Получил</w:t>
+                    <w:br/>
+                    <w:t>5 талантов</w:t>
+                  </w:r>
+                </w:p>
+              </w:tc>
+            </w:tr>
+          </w:tbl>
+          <w:p>
+            <w:pPr>
+              <w:spacing w:after="0" w:line="20" w:lineRule="exact"/>
+            </w:pPr>
+            <w:r>
+              <w:rPr>
+                <w:sz w:val="2"/>
+              </w:rPr>
+            </w:r>
+          </w:p>
+        </w:tc>
+        <w:tc>
+          <w:tcPr>
+            <w:tcW w:type="dxa" w:w="5040"/>
+            <w:vAlign w:val="center"/>
+            <w:tcBorders>
+              <w:top w:val="dashed" w:sz="4" w:color="8C8C8C"/>
+              <w:left w:val="dashed" w:sz="4" w:color="8C8C8C"/>
+              <w:bottom w:val="dashed" w:sz="4" w:color="8C8C8C"/>
+              <w:right w:val="dashed" w:sz="4" w:color="8C8C8C"/>
+            </w:tcBorders>
+          </w:tcPr>
+          <w:p>
+            <w:pPr>
+              <w:spacing w:after="0" w:line="20" w:lineRule="exact"/>
+            </w:pPr>
+            <w:r>
+              <w:rPr>
+                <w:sz w:val="2"/>
+              </w:rPr>
+            </w:r>
+          </w:p>
+          <w:tbl>
+            <w:tblPr>
+              <w:tblW w:type="auto" w:w="0"/>
+              <w:tblLayout w:type="fixed"/>
+              <w:tblLook w:firstColumn="1" w:firstRow="1" w:lastColumn="0" w:lastRow="0" w:noHBand="0" w:noVBand="1" w:val="04A0"/>
+            </w:tblPr>
+            <w:tblGrid>
+              <w:gridCol w:w="1584"/>
+              <w:gridCol w:w="3024"/>
+            </w:tblGrid>
+            <w:tr>
+              <w:tc>
+                <w:tcPr>
+                  <w:tcW w:type="dxa" w:w="1584"/>
+                  <w:vAlign w:val="center"/>
+                </w:tcPr>
+                <w:p>
+                  <w:pPr>
+                    <w:spacing w:after="40"/>
+                  </w:pPr>
+                  <w:r>
+                    <w:drawing>
+                      <wp:inline xmlns:a="http://schemas.openxmlformats.org/drawingml/2006/main" xmlns:pic="http://schemas.openxmlformats.org/drawingml/2006/picture">
+                        <wp:extent cx="868680" cy="488892"/>
+                        <wp:docPr id="3" name="Picture 3" descr="Иллюстрация по теме карточки"/>
+                        <wp:cNvGraphicFramePr>
+                          <a:graphicFrameLocks noChangeAspect="1"/>
+                        </wp:cNvGraphicFramePr>
+                        <a:graphic>
+                          <a:graphicData uri="http://schemas.openxmlformats.org/drawingml/2006/picture">
+                            <pic:pic>
+                              <pic:nvPicPr>
+                                <pic:cNvPr id="0" name="02.jpg"/>
+                                <pic:cNvPicPr/>
+                              </pic:nvPicPr>
+                              <pic:blipFill>
+                                <a:blip r:embed="rId11"/>
+                                <a:stretch>
+                                  <a:fillRect/>
+                                </a:stretch>
+                              </pic:blipFill>
+                              <pic:spPr>
+                                <a:xfrm>
+                                  <a:off x="0" y="0"/>
+                                  <a:ext cx="868680" cy="488892"/>
+                                </a:xfrm>
+                                <a:prstGeom prst="rect"/>
+                              </pic:spPr>
+                            </pic:pic>
+                          </a:graphicData>
+                        </a:graphic>
+                      </wp:inline>
+                    </w:drawing>
+                  </w:r>
+                </w:p>
+              </w:tc>
+              <w:tc>
+                <w:tcPr>
+                  <w:tcW w:type="dxa" w:w="3024"/>
+                  <w:vAlign w:val="center"/>
+                </w:tcPr>
+                <w:p>
+                  <w:pPr>
+                    <w:spacing w:after="40" w:line="240" w:lineRule="auto"/>
+                  </w:pPr>
+                  <w:r>
+                    <w:rPr>
+                      <w:sz w:val="38"/>
+                    </w:rPr>
+                    <w:t>Получил</w:t>
+                    <w:br/>
+                    <w:t>2 таланта</w:t>
+                  </w:r>
+                </w:p>
+              </w:tc>
+            </w:tr>
+          </w:tbl>
+          <w:p>
+            <w:pPr>
+              <w:spacing w:after="0" w:line="20" w:lineRule="exact"/>
+            </w:pPr>
+            <w:r>
+              <w:rPr>
+                <w:sz w:val="2"/>
+              </w:rPr>
+            </w:r>
+          </w:p>
+        </w:tc>
+      </w:tr>
+      <w:tr>
+        <w:trPr>
+          <w:cantSplit/>
+        </w:trPr>
+        <w:tc>
+          <w:tcPr>
+            <w:tcW w:type="dxa" w:w="5040"/>
+            <w:vAlign w:val="center"/>
+            <w:tcBorders>
+              <w:top w:val="dashed" w:sz="4" w:color="8C8C8C"/>
+              <w:left w:val="dashed" w:sz="4" w:color="8C8C8C"/>
+              <w:bottom w:val="dashed" w:sz="4" w:color="8C8C8C"/>
+              <w:right w:val="dashed" w:sz="4" w:color="8C8C8C"/>
+            </w:tcBorders>
+          </w:tcPr>
+          <w:p>
+            <w:pPr>
+              <w:spacing w:after="0" w:line="20" w:lineRule="exact"/>
+            </w:pPr>
+            <w:r>
+              <w:rPr>
+                <w:sz w:val="2"/>
+              </w:rPr>
+            </w:r>
+          </w:p>
+          <w:tbl>
+            <w:tblPr>
+              <w:tblW w:type="auto" w:w="0"/>
+              <w:tblLayout w:type="fixed"/>
+              <w:tblLook w:firstColumn="1" w:firstRow="1" w:lastColumn="0" w:lastRow="0" w:noHBand="0" w:noVBand="1" w:val="04A0"/>
+            </w:tblPr>
+            <w:tblGrid>
+              <w:gridCol w:w="1584"/>
+              <w:gridCol w:w="3024"/>
+            </w:tblGrid>
+            <w:tr>
+              <w:tc>
+                <w:tcPr>
+                  <w:tcW w:type="dxa" w:w="1584"/>
+                  <w:vAlign w:val="center"/>
+                </w:tcPr>
+                <w:p>
+                  <w:pPr>
+                    <w:spacing w:after="40"/>
+                  </w:pPr>
+                  <w:r>
+                    <w:drawing>
+                      <wp:inline xmlns:a="http://schemas.openxmlformats.org/drawingml/2006/main" xmlns:pic="http://schemas.openxmlformats.org/drawingml/2006/picture">
+                        <wp:extent cx="868680" cy="488892"/>
+                        <wp:docPr id="4" name="Picture 4" descr="Иллюстрация по теме карточки"/>
+                        <wp:cNvGraphicFramePr>
+                          <a:graphicFrameLocks noChangeAspect="1"/>
+                        </wp:cNvGraphicFramePr>
+                        <a:graphic>
+                          <a:graphicData uri="http://schemas.openxmlformats.org/drawingml/2006/picture">
+                            <pic:pic>
+                              <pic:nvPicPr>
+                                <pic:cNvPr id="0" name="02.jpg"/>
+                                <pic:cNvPicPr/>
+                              </pic:nvPicPr>
+                              <pic:blipFill>
+                                <a:blip r:embed="rId11"/>
+                                <a:stretch>
+                                  <a:fillRect/>
+                                </a:stretch>
+                              </pic:blipFill>
+                              <pic:spPr>
+                                <a:xfrm>
+                                  <a:off x="0" y="0"/>
+                                  <a:ext cx="868680" cy="488892"/>
+                                </a:xfrm>
+                                <a:prstGeom prst="rect"/>
+                              </pic:spPr>
+                            </pic:pic>
+                          </a:graphicData>
+                        </a:graphic>
+                      </wp:inline>
+                    </w:drawing>
+                  </w:r>
+                </w:p>
+              </w:tc>
+              <w:tc>
+                <w:tcPr>
+                  <w:tcW w:type="dxa" w:w="3024"/>
+                  <w:vAlign w:val="center"/>
+                </w:tcPr>
+                <w:p>
+                  <w:pPr>
+                    <w:spacing w:after="40" w:line="240" w:lineRule="auto"/>
+                  </w:pPr>
+                  <w:r>
+                    <w:rPr>
+                      <w:sz w:val="38"/>
+                    </w:rPr>
+                    <w:t>Получил</w:t>
+                    <w:br/>
+                    <w:t>1 талант</w:t>
+                  </w:r>
+                </w:p>
+              </w:tc>
+            </w:tr>
+          </w:tbl>
+          <w:p>
+            <w:pPr>
+              <w:spacing w:after="0" w:line="20" w:lineRule="exact"/>
+            </w:pPr>
+            <w:r>
+              <w:rPr>
+                <w:sz w:val="2"/>
+              </w:rPr>
+            </w:r>
+          </w:p>
+        </w:tc>
+        <w:tc>
+          <w:tcPr>
+            <w:tcW w:type="dxa" w:w="5040"/>
+            <w:vAlign w:val="center"/>
+            <w:tcBorders>
+              <w:top w:val="dashed" w:sz="4" w:color="8C8C8C"/>
+              <w:left w:val="dashed" w:sz="4" w:color="8C8C8C"/>
+              <w:bottom w:val="dashed" w:sz="4" w:color="8C8C8C"/>
+              <w:right w:val="dashed" w:sz="4" w:color="8C8C8C"/>
+            </w:tcBorders>
+          </w:tcPr>
+          <w:p>
+            <w:pPr>
+              <w:spacing w:after="0" w:line="20" w:lineRule="exact"/>
+            </w:pPr>
+            <w:r>
+              <w:rPr>
+                <w:sz w:val="2"/>
+              </w:rPr>
+            </w:r>
+          </w:p>
+          <w:tbl>
+            <w:tblPr>
+              <w:tblW w:type="auto" w:w="0"/>
+              <w:tblLayout w:type="fixed"/>
+              <w:tblLook w:firstColumn="1" w:firstRow="1" w:lastColumn="0" w:lastRow="0" w:noHBand="0" w:noVBand="1" w:val="04A0"/>
+            </w:tblPr>
+            <w:tblGrid>
+              <w:gridCol w:w="1584"/>
+              <w:gridCol w:w="3024"/>
+            </w:tblGrid>
+            <w:tr>
+              <w:tc>
+                <w:tcPr>
+                  <w:tcW w:type="dxa" w:w="1584"/>
+                  <w:vAlign w:val="center"/>
+                </w:tcPr>
+                <w:p>
+                  <w:pPr>
+                    <w:spacing w:after="40"/>
+                  </w:pPr>
+                  <w:r>
+                    <w:drawing>
+                      <wp:inline xmlns:a="http://schemas.openxmlformats.org/drawingml/2006/main" xmlns:pic="http://schemas.openxmlformats.org/drawingml/2006/picture">
+                        <wp:extent cx="868680" cy="488892"/>
+                        <wp:docPr id="5" name="Picture 5" descr="Иллюстрация по теме карточки"/>
+                        <wp:cNvGraphicFramePr>
+                          <a:graphicFrameLocks noChangeAspect="1"/>
+                        </wp:cNvGraphicFramePr>
+                        <a:graphic>
+                          <a:graphicData uri="http://schemas.openxmlformats.org/drawingml/2006/picture">
+                            <pic:pic>
+                              <pic:nvPicPr>
+                                <pic:cNvPr id="0" name="02.jpg"/>
+                                <pic:cNvPicPr/>
+                              </pic:nvPicPr>
+                              <pic:blipFill>
+                                <a:blip r:embed="rId11"/>
+                                <a:stretch>
+                                  <a:fillRect/>
+                                </a:stretch>
+                              </pic:blipFill>
+                              <pic:spPr>
+                                <a:xfrm>
+                                  <a:off x="0" y="0"/>
+                                  <a:ext cx="868680" cy="488892"/>
+                                </a:xfrm>
+                                <a:prstGeom prst="rect"/>
+                              </pic:spPr>
+                            </pic:pic>
+                          </a:graphicData>
+                        </a:graphic>
+                      </wp:inline>
+                    </w:drawing>
+                  </w:r>
+                </w:p>
+              </w:tc>
+              <w:tc>
+                <w:tcPr>
+                  <w:tcW w:type="dxa" w:w="3024"/>
+                  <w:vAlign w:val="center"/>
+                </w:tcPr>
+                <w:p>
+                  <w:pPr>
+                    <w:spacing w:after="40" w:line="240" w:lineRule="auto"/>
+                  </w:pPr>
+                  <w:r>
+                    <w:rPr>
+                      <w:sz w:val="38"/>
+                    </w:rPr>
+                    <w:t>Всего</w:t>
+                    <w:br/>
+                    <w:t>10 талантов</w:t>
+                  </w:r>
+                </w:p>
+              </w:tc>
+            </w:tr>
+          </w:tbl>
+          <w:p>
+            <w:pPr>
+              <w:spacing w:after="0" w:line="20" w:lineRule="exact"/>
+            </w:pPr>
+            <w:r>
+              <w:rPr>
+                <w:sz w:val="2"/>
+              </w:rPr>
+            </w:r>
+          </w:p>
+        </w:tc>
+      </w:tr>
+      <w:tr>
+        <w:trPr>
+          <w:cantSplit/>
+        </w:trPr>
+        <w:tc>
+          <w:tcPr>
+            <w:tcW w:type="dxa" w:w="5040"/>
+            <w:vAlign w:val="center"/>
+            <w:tcBorders>
+              <w:top w:val="dashed" w:sz="4" w:color="8C8C8C"/>
+              <w:left w:val="dashed" w:sz="4" w:color="8C8C8C"/>
+              <w:bottom w:val="dashed" w:sz="4" w:color="8C8C8C"/>
+              <w:right w:val="dashed" w:sz="4" w:color="8C8C8C"/>
+            </w:tcBorders>
+          </w:tcPr>
+          <w:p>
+            <w:pPr>
+              <w:spacing w:after="0" w:line="20" w:lineRule="exact"/>
+            </w:pPr>
+            <w:r>
+              <w:rPr>
+                <w:sz w:val="2"/>
+              </w:rPr>
+            </w:r>
+          </w:p>
+          <w:tbl>
+            <w:tblPr>
+              <w:tblW w:type="auto" w:w="0"/>
+              <w:tblLayout w:type="fixed"/>
+              <w:tblLook w:firstColumn="1" w:firstRow="1" w:lastColumn="0" w:lastRow="0" w:noHBand="0" w:noVBand="1" w:val="04A0"/>
+            </w:tblPr>
+            <w:tblGrid>
+              <w:gridCol w:w="1584"/>
+              <w:gridCol w:w="3024"/>
+            </w:tblGrid>
+            <w:tr>
+              <w:tc>
+                <w:tcPr>
+                  <w:tcW w:type="dxa" w:w="1584"/>
+                  <w:vAlign w:val="center"/>
+                </w:tcPr>
+                <w:p>
+                  <w:pPr>
+                    <w:spacing w:after="40"/>
+                  </w:pPr>
+                  <w:r>
+                    <w:drawing>
+                      <wp:inline xmlns:a="http://schemas.openxmlformats.org/drawingml/2006/main" xmlns:pic="http://schemas.openxmlformats.org/drawingml/2006/picture">
+                        <wp:extent cx="868680" cy="488892"/>
+                        <wp:docPr id="6" name="Picture 6" descr="Иллюстрация по теме карточки"/>
+                        <wp:cNvGraphicFramePr>
+                          <a:graphicFrameLocks noChangeAspect="1"/>
+                        </wp:cNvGraphicFramePr>
+                        <a:graphic>
+                          <a:graphicData uri="http://schemas.openxmlformats.org/drawingml/2006/picture">
+                            <pic:pic>
+                              <pic:nvPicPr>
+                                <pic:cNvPr id="0" name="02.jpg"/>
+                                <pic:cNvPicPr/>
+                              </pic:nvPicPr>
+                              <pic:blipFill>
+                                <a:blip r:embed="rId11"/>
+                                <a:stretch>
+                                  <a:fillRect/>
+                                </a:stretch>
+                              </pic:blipFill>
+                              <pic:spPr>
+                                <a:xfrm>
+                                  <a:off x="0" y="0"/>
+                                  <a:ext cx="868680" cy="488892"/>
+                                </a:xfrm>
+                                <a:prstGeom prst="rect"/>
+                              </pic:spPr>
+                            </pic:pic>
+                          </a:graphicData>
+                        </a:graphic>
+                      </wp:inline>
+                    </w:drawing>
+                  </w:r>
+                </w:p>
+              </w:tc>
+              <w:tc>
+                <w:tcPr>
+                  <w:tcW w:type="dxa" w:w="3024"/>
+                  <w:vAlign w:val="center"/>
+                </w:tcPr>
+                <w:p>
+                  <w:pPr>
+                    <w:spacing w:after="40" w:line="240" w:lineRule="auto"/>
+                  </w:pPr>
+                  <w:r>
+                    <w:rPr>
+                      <w:sz w:val="38"/>
+                    </w:rPr>
+                    <w:t>Всего</w:t>
+                    <w:br/>
+                    <w:t>4 таланта</w:t>
+                  </w:r>
+                </w:p>
+              </w:tc>
+            </w:tr>
+          </w:tbl>
+          <w:p>
+            <w:pPr>
+              <w:spacing w:after="0" w:line="20" w:lineRule="exact"/>
+            </w:pPr>
+            <w:r>
+              <w:rPr>
+                <w:sz w:val="2"/>
+              </w:rPr>
+            </w:r>
+          </w:p>
+        </w:tc>
+        <w:tc>
+          <w:tcPr>
+            <w:tcW w:type="dxa" w:w="5040"/>
+            <w:vAlign w:val="center"/>
+            <w:tcBorders>
+              <w:top w:val="dashed" w:sz="4" w:color="8C8C8C"/>
+              <w:left w:val="dashed" w:sz="4" w:color="8C8C8C"/>
+              <w:bottom w:val="dashed" w:sz="4" w:color="8C8C8C"/>
+              <w:right w:val="dashed" w:sz="4" w:color="8C8C8C"/>
+            </w:tcBorders>
+          </w:tcPr>
+          <w:p>
+            <w:pPr>
+              <w:spacing w:after="0" w:line="20" w:lineRule="exact"/>
+            </w:pPr>
+            <w:r>
+              <w:rPr>
+                <w:sz w:val="2"/>
+              </w:rPr>
+            </w:r>
+          </w:p>
+          <w:tbl>
+            <w:tblPr>
+              <w:tblW w:type="auto" w:w="0"/>
+              <w:tblLayout w:type="fixed"/>
+              <w:tblLook w:firstColumn="1" w:firstRow="1" w:lastColumn="0" w:lastRow="0" w:noHBand="0" w:noVBand="1" w:val="04A0"/>
+            </w:tblPr>
+            <w:tblGrid>
+              <w:gridCol w:w="1584"/>
+              <w:gridCol w:w="3024"/>
+            </w:tblGrid>
+            <w:tr>
+              <w:tc>
+                <w:tcPr>
+                  <w:tcW w:type="dxa" w:w="1584"/>
+                  <w:vAlign w:val="center"/>
+                </w:tcPr>
+                <w:p>
+                  <w:pPr>
+                    <w:spacing w:after="40"/>
+                  </w:pPr>
+                  <w:r>
+                    <w:drawing>
+                      <wp:inline xmlns:a="http://schemas.openxmlformats.org/drawingml/2006/main" xmlns:pic="http://schemas.openxmlformats.org/drawingml/2006/picture">
+                        <wp:extent cx="868680" cy="488892"/>
+                        <wp:docPr id="7" name="Picture 7" descr="Иллюстрация по теме карточки"/>
+                        <wp:cNvGraphicFramePr>
+                          <a:graphicFrameLocks noChangeAspect="1"/>
+                        </wp:cNvGraphicFramePr>
+                        <a:graphic>
+                          <a:graphicData uri="http://schemas.openxmlformats.org/drawingml/2006/picture">
+                            <pic:pic>
+                              <pic:nvPicPr>
+                                <pic:cNvPr id="0" name="02.jpg"/>
+                                <pic:cNvPicPr/>
+                              </pic:nvPicPr>
+                              <pic:blipFill>
+                                <a:blip r:embed="rId11"/>
+                                <a:stretch>
+                                  <a:fillRect/>
+                                </a:stretch>
+                              </pic:blipFill>
+                              <pic:spPr>
+                                <a:xfrm>
+                                  <a:off x="0" y="0"/>
+                                  <a:ext cx="868680" cy="488892"/>
+                                </a:xfrm>
+                                <a:prstGeom prst="rect"/>
+                              </pic:spPr>
+                            </pic:pic>
+                          </a:graphicData>
+                        </a:graphic>
+                      </wp:inline>
+                    </w:drawing>
+                  </w:r>
+                </w:p>
+              </w:tc>
+              <w:tc>
+                <w:tcPr>
+                  <w:tcW w:type="dxa" w:w="3024"/>
+                  <w:vAlign w:val="center"/>
+                </w:tcPr>
+                <w:p>
+                  <w:pPr>
+                    <w:spacing w:after="40" w:line="240" w:lineRule="auto"/>
+                  </w:pPr>
+                  <w:r>
+                    <w:rPr>
+                      <w:sz w:val="38"/>
+                    </w:rPr>
+                    <w:t>Всего</w:t>
+                    <w:br/>
+                    <w:t>1 талант</w:t>
+                  </w:r>
+                </w:p>
+              </w:tc>
+            </w:tr>
+          </w:tbl>
+          <w:p>
+            <w:pPr>
+              <w:spacing w:after="0" w:line="20" w:lineRule="exact"/>
+            </w:pPr>
+            <w:r>
+              <w:rPr>
+                <w:sz w:val="2"/>
+              </w:rPr>
+            </w:r>
+          </w:p>
+        </w:tc>
+      </w:tr>
+    </w:tbl>
+    <w:tbl>
+      <w:tblPr>
+        <w:tblW w:type="auto" w:w="0"/>
+        <w:tblLayout w:type="fixed"/>
+        <w:tblLook w:firstColumn="1" w:firstRow="1" w:lastColumn="0" w:lastRow="0" w:noHBand="0" w:noVBand="1" w:val="04A0"/>
+      </w:tblPr>
+      <w:tblGrid>
+        <w:gridCol w:w="5040"/>
+        <w:gridCol w:w="5040"/>
+      </w:tblGrid>
+      <w:tr>
+        <w:trPr>
+          <w:cantSplit/>
+        </w:trPr>
+        <w:tc>
+          <w:tcPr>
+            <w:tcW w:type="dxa" w:w="5040"/>
+            <w:vAlign w:val="center"/>
+            <w:tcBorders>
+              <w:top w:val="dashed" w:sz="4" w:color="8C8C8C"/>
+              <w:left w:val="dashed" w:sz="4" w:color="8C8C8C"/>
+              <w:bottom w:val="dashed" w:sz="4" w:color="8C8C8C"/>
+              <w:right w:val="dashed" w:sz="4" w:color="8C8C8C"/>
+            </w:tcBorders>
+          </w:tcPr>
+          <w:p>
+            <w:pPr>
+              <w:spacing w:after="0" w:line="20" w:lineRule="exact"/>
+            </w:pPr>
+            <w:r>
+              <w:rPr>
+                <w:sz w:val="2"/>
+              </w:rPr>
+            </w:r>
+          </w:p>
+          <w:tbl>
+            <w:tblPr>
+              <w:tblW w:type="auto" w:w="0"/>
+              <w:tblLayout w:type="fixed"/>
+              <w:tblLook w:firstColumn="1" w:firstRow="1" w:lastColumn="0" w:lastRow="0" w:noHBand="0" w:noVBand="1" w:val="04A0"/>
+            </w:tblPr>
+            <w:tblGrid>
+              <w:gridCol w:w="1584"/>
+              <w:gridCol w:w="3024"/>
+            </w:tblGrid>
+            <w:tr>
+              <w:tc>
+                <w:tcPr>
+                  <w:tcW w:type="dxa" w:w="1584"/>
+                  <w:vAlign w:val="center"/>
+                </w:tcPr>
+                <w:p>
+                  <w:pPr>
+                    <w:spacing w:after="40"/>
+                  </w:pPr>
+                  <w:r>
+                    <w:drawing>
+                      <wp:inline xmlns:a="http://schemas.openxmlformats.org/drawingml/2006/main" xmlns:pic="http://schemas.openxmlformats.org/drawingml/2006/picture">
+                        <wp:extent cx="868680" cy="488892"/>
+                        <wp:docPr id="8" name="Picture 8" descr="Иллюстрация по теме карточки"/>
+                        <wp:cNvGraphicFramePr>
+                          <a:graphicFrameLocks noChangeAspect="1"/>
+                        </wp:cNvGraphicFramePr>
+                        <a:graphic>
+                          <a:graphicData uri="http://schemas.openxmlformats.org/drawingml/2006/picture">
+                            <pic:pic>
+                              <pic:nvPicPr>
+                                <pic:cNvPr id="0" name="02.jpg"/>
+                                <pic:cNvPicPr/>
+                              </pic:nvPicPr>
+                              <pic:blipFill>
+                                <a:blip r:embed="rId11"/>
+                                <a:stretch>
+                                  <a:fillRect/>
+                                </a:stretch>
+                              </pic:blipFill>
+                              <pic:spPr>
+                                <a:xfrm>
+                                  <a:off x="0" y="0"/>
+                                  <a:ext cx="868680" cy="488892"/>
+                                </a:xfrm>
+                                <a:prstGeom prst="rect"/>
+                              </pic:spPr>
+                            </pic:pic>
+                          </a:graphicData>
+                        </a:graphic>
+                      </wp:inline>
+                    </w:drawing>
+                  </w:r>
+                </w:p>
+              </w:tc>
+              <w:tc>
+                <w:tcPr>
+                  <w:tcW w:type="dxa" w:w="3024"/>
+                  <w:vAlign w:val="center"/>
+                </w:tcPr>
+                <w:p>
+                  <w:pPr>
+                    <w:spacing w:after="40" w:line="240" w:lineRule="auto"/>
+                  </w:pPr>
+                  <w:r>
+                    <w:rPr>
+                      <w:sz w:val="30"/>
+                    </w:rPr>
+                    <w:t>ИСПОЛЬЗОВАЛ</w:t>
+                  </w:r>
+                </w:p>
+              </w:tc>
+            </w:tr>
+          </w:tbl>
+          <w:p>
+            <w:pPr>
+              <w:spacing w:after="0" w:line="20" w:lineRule="exact"/>
+            </w:pPr>
+            <w:r>
+              <w:rPr>
+                <w:sz w:val="2"/>
+              </w:rPr>
+            </w:r>
+          </w:p>
+        </w:tc>
+        <w:tc>
+          <w:tcPr>
+            <w:tcW w:type="dxa" w:w="5040"/>
+            <w:vAlign w:val="center"/>
+            <w:tcBorders>
+              <w:top w:val="dashed" w:sz="4" w:color="8C8C8C"/>
+              <w:left w:val="dashed" w:sz="4" w:color="8C8C8C"/>
+              <w:bottom w:val="dashed" w:sz="4" w:color="8C8C8C"/>
+              <w:right w:val="dashed" w:sz="4" w:color="8C8C8C"/>
+            </w:tcBorders>
+          </w:tcPr>
+          <w:p>
+            <w:pPr>
+              <w:spacing w:after="0" w:line="20" w:lineRule="exact"/>
+            </w:pPr>
+            <w:r>
+              <w:rPr>
+                <w:sz w:val="2"/>
+              </w:rPr>
+            </w:r>
+          </w:p>
+          <w:tbl>
+            <w:tblPr>
+              <w:tblW w:type="auto" w:w="0"/>
+              <w:tblLayout w:type="fixed"/>
+              <w:tblLook w:firstColumn="1" w:firstRow="1" w:lastColumn="0" w:lastRow="0" w:noHBand="0" w:noVBand="1" w:val="04A0"/>
+            </w:tblPr>
+            <w:tblGrid>
+              <w:gridCol w:w="1584"/>
+              <w:gridCol w:w="3024"/>
+            </w:tblGrid>
+            <w:tr>
+              <w:tc>
+                <w:tcPr>
+                  <w:tcW w:type="dxa" w:w="1584"/>
+                  <w:vAlign w:val="center"/>
+                </w:tcPr>
+                <w:p>
+                  <w:pPr>
+                    <w:spacing w:after="40"/>
+                  </w:pPr>
+                  <w:r>
+                    <w:drawing>
+                      <wp:inline xmlns:a="http://schemas.openxmlformats.org/drawingml/2006/main" xmlns:pic="http://schemas.openxmlformats.org/drawingml/2006/picture">
+                        <wp:extent cx="868680" cy="488892"/>
+                        <wp:docPr id="9" name="Picture 9" descr="Иллюстрация по теме карточки"/>
+                        <wp:cNvGraphicFramePr>
+                          <a:graphicFrameLocks noChangeAspect="1"/>
+                        </wp:cNvGraphicFramePr>
+                        <a:graphic>
+                          <a:graphicData uri="http://schemas.openxmlformats.org/drawingml/2006/picture">
+                            <pic:pic>
+                              <pic:nvPicPr>
+                                <pic:cNvPr id="0" name="03.jpg"/>
+                                <pic:cNvPicPr/>
+                              </pic:nvPicPr>
+                              <pic:blipFill>
+                                <a:blip r:embed="rId12"/>
+                                <a:stretch>
+                                  <a:fillRect/>
+                                </a:stretch>
+                              </pic:blipFill>
+                              <pic:spPr>
+                                <a:xfrm>
+                                  <a:off x="0" y="0"/>
+                                  <a:ext cx="868680" cy="488892"/>
+                                </a:xfrm>
+                                <a:prstGeom prst="rect"/>
+                              </pic:spPr>
+                            </pic:pic>
+                          </a:graphicData>
+                        </a:graphic>
+                      </wp:inline>
+                    </w:drawing>
+                  </w:r>
+                </w:p>
+              </w:tc>
+              <w:tc>
+                <w:tcPr>
+                  <w:tcW w:type="dxa" w:w="3024"/>
+                  <w:vAlign w:val="center"/>
+                </w:tcPr>
+                <w:p>
+                  <w:pPr>
+                    <w:spacing w:after="40" w:line="240" w:lineRule="auto"/>
+                  </w:pPr>
+                  <w:r>
+                    <w:rPr>
+                      <w:sz w:val="30"/>
+                    </w:rPr>
+                    <w:t>СПРЯТАЛ</w:t>
+                  </w:r>
+                </w:p>
+              </w:tc>
+            </w:tr>
+          </w:tbl>
+          <w:p>
+            <w:pPr>
+              <w:spacing w:after="0" w:line="20" w:lineRule="exact"/>
+            </w:pPr>
+            <w:r>
+              <w:rPr>
+                <w:sz w:val="2"/>
+              </w:rPr>
+            </w:r>
+          </w:p>
+        </w:tc>
+      </w:tr>
+    </w:tbl>
     <w:p>
       <w:r>
-        <w:t>Жесты группы: использовал — раскрытая ладонь; спрятал — ладонь сверху. После ответа учитель показывает таблицу слайда 3.</w:t>
+        <w:t>Жесты: использовал — раскрытая ладонь; спрятал — ладонь сверху. После ответа учитель показывает таблицу слайда 3.</w:t>
       </w:r>
     </w:p>
     <w:p>
@@ -242,57 +1139,458 @@
     </w:p>
     <w:p>
       <w:r>
-        <w:t>Вырежьте четыре фразы. В парах разложите их на две стороны стола: «В притче» и «В нашей жизни».</w:t>
+        <w:t>Вырежьте четыре фразы. Разложите в парах: «В притче» и «В нашей жизни».</w:t>
       </w:r>
     </w:p>
-    <w:p>
-      <w:pPr>
-        <w:spacing w:before="240"/>
-      </w:pPr>
-      <w:r>
-        <w:rPr>
-          <w:b/>
-          <w:sz w:val="36"/>
-        </w:rPr>
-        <w:t>Хозяин дал пять талантов</w:t>
-      </w:r>
-    </w:p>
-    <w:p>
-      <w:pPr>
-        <w:spacing w:before="240"/>
-      </w:pPr>
-      <w:r>
-        <w:rPr>
-          <w:b/>
-          <w:sz w:val="36"/>
-        </w:rPr>
-        <w:t>Слуга закопал серебро</w:t>
-      </w:r>
-    </w:p>
-    <w:p>
-      <w:pPr>
-        <w:spacing w:before="240"/>
-      </w:pPr>
-      <w:r>
-        <w:rPr>
-          <w:b/>
-          <w:sz w:val="36"/>
-        </w:rPr>
-        <w:t>Я умею рисовать</w:t>
-      </w:r>
-    </w:p>
-    <w:p>
-      <w:pPr>
-        <w:spacing w:before="240"/>
-      </w:pPr>
-      <w:r>
-        <w:rPr>
-          <w:b/>
-          <w:sz w:val="36"/>
-        </w:rPr>
-        <w:t>Я умею слушать</w:t>
-      </w:r>
-    </w:p>
+    <w:tbl>
+      <w:tblPr>
+        <w:tblW w:type="auto" w:w="0"/>
+        <w:tblLayout w:type="fixed"/>
+        <w:tblLook w:firstColumn="1" w:firstRow="1" w:lastColumn="0" w:lastRow="0" w:noHBand="0" w:noVBand="1" w:val="04A0"/>
+      </w:tblPr>
+      <w:tblGrid>
+        <w:gridCol w:w="5040"/>
+        <w:gridCol w:w="5040"/>
+      </w:tblGrid>
+      <w:tr>
+        <w:trPr>
+          <w:cantSplit/>
+        </w:trPr>
+        <w:tc>
+          <w:tcPr>
+            <w:tcW w:type="dxa" w:w="5040"/>
+            <w:vAlign w:val="center"/>
+            <w:tcBorders>
+              <w:top w:val="dashed" w:sz="4" w:color="8C8C8C"/>
+              <w:left w:val="dashed" w:sz="4" w:color="8C8C8C"/>
+              <w:bottom w:val="dashed" w:sz="4" w:color="8C8C8C"/>
+              <w:right w:val="dashed" w:sz="4" w:color="8C8C8C"/>
+            </w:tcBorders>
+          </w:tcPr>
+          <w:p>
+            <w:pPr>
+              <w:spacing w:after="0" w:line="20" w:lineRule="exact"/>
+            </w:pPr>
+            <w:r>
+              <w:rPr>
+                <w:sz w:val="2"/>
+              </w:rPr>
+            </w:r>
+          </w:p>
+          <w:tbl>
+            <w:tblPr>
+              <w:tblW w:type="auto" w:w="0"/>
+              <w:tblLayout w:type="fixed"/>
+              <w:tblLook w:firstColumn="1" w:firstRow="1" w:lastColumn="0" w:lastRow="0" w:noHBand="0" w:noVBand="1" w:val="04A0"/>
+            </w:tblPr>
+            <w:tblGrid>
+              <w:gridCol w:w="1584"/>
+              <w:gridCol w:w="3024"/>
+            </w:tblGrid>
+            <w:tr>
+              <w:tc>
+                <w:tcPr>
+                  <w:tcW w:type="dxa" w:w="1584"/>
+                  <w:vAlign w:val="center"/>
+                </w:tcPr>
+                <w:p>
+                  <w:pPr>
+                    <w:spacing w:after="40"/>
+                  </w:pPr>
+                  <w:r>
+                    <w:drawing>
+                      <wp:inline xmlns:a="http://schemas.openxmlformats.org/drawingml/2006/main" xmlns:pic="http://schemas.openxmlformats.org/drawingml/2006/picture">
+                        <wp:extent cx="868680" cy="488892"/>
+                        <wp:docPr id="10" name="Picture 10" descr="Иллюстрация по теме карточки"/>
+                        <wp:cNvGraphicFramePr>
+                          <a:graphicFrameLocks noChangeAspect="1"/>
+                        </wp:cNvGraphicFramePr>
+                        <a:graphic>
+                          <a:graphicData uri="http://schemas.openxmlformats.org/drawingml/2006/picture">
+                            <pic:pic>
+                              <pic:nvPicPr>
+                                <pic:cNvPr id="0" name="02.jpg"/>
+                                <pic:cNvPicPr/>
+                              </pic:nvPicPr>
+                              <pic:blipFill>
+                                <a:blip r:embed="rId11"/>
+                                <a:stretch>
+                                  <a:fillRect/>
+                                </a:stretch>
+                              </pic:blipFill>
+                              <pic:spPr>
+                                <a:xfrm>
+                                  <a:off x="0" y="0"/>
+                                  <a:ext cx="868680" cy="488892"/>
+                                </a:xfrm>
+                                <a:prstGeom prst="rect"/>
+                              </pic:spPr>
+                            </pic:pic>
+                          </a:graphicData>
+                        </a:graphic>
+                      </wp:inline>
+                    </w:drawing>
+                  </w:r>
+                </w:p>
+              </w:tc>
+              <w:tc>
+                <w:tcPr>
+                  <w:tcW w:type="dxa" w:w="3024"/>
+                  <w:vAlign w:val="center"/>
+                </w:tcPr>
+                <w:p>
+                  <w:pPr>
+                    <w:spacing w:after="40" w:line="240" w:lineRule="auto"/>
+                  </w:pPr>
+                  <w:r>
+                    <w:rPr>
+                      <w:sz w:val="28"/>
+                    </w:rPr>
+                    <w:t>Хозяин дал пять талантов</w:t>
+                  </w:r>
+                </w:p>
+              </w:tc>
+            </w:tr>
+          </w:tbl>
+          <w:p>
+            <w:pPr>
+              <w:spacing w:after="0" w:line="20" w:lineRule="exact"/>
+            </w:pPr>
+            <w:r>
+              <w:rPr>
+                <w:sz w:val="2"/>
+              </w:rPr>
+            </w:r>
+          </w:p>
+        </w:tc>
+        <w:tc>
+          <w:tcPr>
+            <w:tcW w:type="dxa" w:w="5040"/>
+            <w:vAlign w:val="center"/>
+            <w:tcBorders>
+              <w:top w:val="dashed" w:sz="4" w:color="8C8C8C"/>
+              <w:left w:val="dashed" w:sz="4" w:color="8C8C8C"/>
+              <w:bottom w:val="dashed" w:sz="4" w:color="8C8C8C"/>
+              <w:right w:val="dashed" w:sz="4" w:color="8C8C8C"/>
+            </w:tcBorders>
+          </w:tcPr>
+          <w:p>
+            <w:pPr>
+              <w:spacing w:after="0" w:line="20" w:lineRule="exact"/>
+            </w:pPr>
+            <w:r>
+              <w:rPr>
+                <w:sz w:val="2"/>
+              </w:rPr>
+            </w:r>
+          </w:p>
+          <w:tbl>
+            <w:tblPr>
+              <w:tblW w:type="auto" w:w="0"/>
+              <w:tblLayout w:type="fixed"/>
+              <w:tblLook w:firstColumn="1" w:firstRow="1" w:lastColumn="0" w:lastRow="0" w:noHBand="0" w:noVBand="1" w:val="04A0"/>
+            </w:tblPr>
+            <w:tblGrid>
+              <w:gridCol w:w="1584"/>
+              <w:gridCol w:w="3024"/>
+            </w:tblGrid>
+            <w:tr>
+              <w:tc>
+                <w:tcPr>
+                  <w:tcW w:type="dxa" w:w="1584"/>
+                  <w:vAlign w:val="center"/>
+                </w:tcPr>
+                <w:p>
+                  <w:pPr>
+                    <w:spacing w:after="40"/>
+                  </w:pPr>
+                  <w:r>
+                    <w:drawing>
+                      <wp:inline xmlns:a="http://schemas.openxmlformats.org/drawingml/2006/main" xmlns:pic="http://schemas.openxmlformats.org/drawingml/2006/picture">
+                        <wp:extent cx="868680" cy="488892"/>
+                        <wp:docPr id="11" name="Picture 11" descr="Иллюстрация по теме карточки"/>
+                        <wp:cNvGraphicFramePr>
+                          <a:graphicFrameLocks noChangeAspect="1"/>
+                        </wp:cNvGraphicFramePr>
+                        <a:graphic>
+                          <a:graphicData uri="http://schemas.openxmlformats.org/drawingml/2006/picture">
+                            <pic:pic>
+                              <pic:nvPicPr>
+                                <pic:cNvPr id="0" name="03.jpg"/>
+                                <pic:cNvPicPr/>
+                              </pic:nvPicPr>
+                              <pic:blipFill>
+                                <a:blip r:embed="rId12"/>
+                                <a:stretch>
+                                  <a:fillRect/>
+                                </a:stretch>
+                              </pic:blipFill>
+                              <pic:spPr>
+                                <a:xfrm>
+                                  <a:off x="0" y="0"/>
+                                  <a:ext cx="868680" cy="488892"/>
+                                </a:xfrm>
+                                <a:prstGeom prst="rect"/>
+                              </pic:spPr>
+                            </pic:pic>
+                          </a:graphicData>
+                        </a:graphic>
+                      </wp:inline>
+                    </w:drawing>
+                  </w:r>
+                </w:p>
+              </w:tc>
+              <w:tc>
+                <w:tcPr>
+                  <w:tcW w:type="dxa" w:w="3024"/>
+                  <w:vAlign w:val="center"/>
+                </w:tcPr>
+                <w:p>
+                  <w:pPr>
+                    <w:spacing w:after="40" w:line="240" w:lineRule="auto"/>
+                  </w:pPr>
+                  <w:r>
+                    <w:rPr>
+                      <w:sz w:val="28"/>
+                    </w:rPr>
+                    <w:t>Слуга закопал серебро</w:t>
+                  </w:r>
+                </w:p>
+              </w:tc>
+            </w:tr>
+          </w:tbl>
+          <w:p>
+            <w:pPr>
+              <w:spacing w:after="0" w:line="20" w:lineRule="exact"/>
+            </w:pPr>
+            <w:r>
+              <w:rPr>
+                <w:sz w:val="2"/>
+              </w:rPr>
+            </w:r>
+          </w:p>
+        </w:tc>
+      </w:tr>
+      <w:tr>
+        <w:trPr>
+          <w:cantSplit/>
+        </w:trPr>
+        <w:tc>
+          <w:tcPr>
+            <w:tcW w:type="dxa" w:w="5040"/>
+            <w:vAlign w:val="center"/>
+            <w:tcBorders>
+              <w:top w:val="dashed" w:sz="4" w:color="8C8C8C"/>
+              <w:left w:val="dashed" w:sz="4" w:color="8C8C8C"/>
+              <w:bottom w:val="dashed" w:sz="4" w:color="8C8C8C"/>
+              <w:right w:val="dashed" w:sz="4" w:color="8C8C8C"/>
+            </w:tcBorders>
+          </w:tcPr>
+          <w:p>
+            <w:pPr>
+              <w:spacing w:after="0" w:line="20" w:lineRule="exact"/>
+            </w:pPr>
+            <w:r>
+              <w:rPr>
+                <w:sz w:val="2"/>
+              </w:rPr>
+            </w:r>
+          </w:p>
+          <w:tbl>
+            <w:tblPr>
+              <w:tblW w:type="auto" w:w="0"/>
+              <w:tblLayout w:type="fixed"/>
+              <w:tblLook w:firstColumn="1" w:firstRow="1" w:lastColumn="0" w:lastRow="0" w:noHBand="0" w:noVBand="1" w:val="04A0"/>
+            </w:tblPr>
+            <w:tblGrid>
+              <w:gridCol w:w="1584"/>
+              <w:gridCol w:w="3024"/>
+            </w:tblGrid>
+            <w:tr>
+              <w:tc>
+                <w:tcPr>
+                  <w:tcW w:type="dxa" w:w="1584"/>
+                  <w:vAlign w:val="center"/>
+                </w:tcPr>
+                <w:p>
+                  <w:pPr>
+                    <w:spacing w:after="40"/>
+                  </w:pPr>
+                  <w:r>
+                    <w:drawing>
+                      <wp:inline xmlns:a="http://schemas.openxmlformats.org/drawingml/2006/main" xmlns:pic="http://schemas.openxmlformats.org/drawingml/2006/picture">
+                        <wp:extent cx="868680" cy="488892"/>
+                        <wp:docPr id="12" name="Picture 12" descr="Иллюстрация по теме карточки"/>
+                        <wp:cNvGraphicFramePr>
+                          <a:graphicFrameLocks noChangeAspect="1"/>
+                        </wp:cNvGraphicFramePr>
+                        <a:graphic>
+                          <a:graphicData uri="http://schemas.openxmlformats.org/drawingml/2006/picture">
+                            <pic:pic>
+                              <pic:nvPicPr>
+                                <pic:cNvPr id="0" name="01.jpg"/>
+                                <pic:cNvPicPr/>
+                              </pic:nvPicPr>
+                              <pic:blipFill>
+                                <a:blip r:embed="rId10"/>
+                                <a:stretch>
+                                  <a:fillRect/>
+                                </a:stretch>
+                              </pic:blipFill>
+                              <pic:spPr>
+                                <a:xfrm>
+                                  <a:off x="0" y="0"/>
+                                  <a:ext cx="868680" cy="488892"/>
+                                </a:xfrm>
+                                <a:prstGeom prst="rect"/>
+                              </pic:spPr>
+                            </pic:pic>
+                          </a:graphicData>
+                        </a:graphic>
+                      </wp:inline>
+                    </w:drawing>
+                  </w:r>
+                </w:p>
+              </w:tc>
+              <w:tc>
+                <w:tcPr>
+                  <w:tcW w:type="dxa" w:w="3024"/>
+                  <w:vAlign w:val="center"/>
+                </w:tcPr>
+                <w:p>
+                  <w:pPr>
+                    <w:spacing w:after="40" w:line="240" w:lineRule="auto"/>
+                  </w:pPr>
+                  <w:r>
+                    <w:rPr>
+                      <w:sz w:val="28"/>
+                    </w:rPr>
+                    <w:t>Я умею рисовать</w:t>
+                  </w:r>
+                </w:p>
+              </w:tc>
+            </w:tr>
+          </w:tbl>
+          <w:p>
+            <w:pPr>
+              <w:spacing w:after="0" w:line="20" w:lineRule="exact"/>
+            </w:pPr>
+            <w:r>
+              <w:rPr>
+                <w:sz w:val="2"/>
+              </w:rPr>
+            </w:r>
+          </w:p>
+        </w:tc>
+        <w:tc>
+          <w:tcPr>
+            <w:tcW w:type="dxa" w:w="5040"/>
+            <w:vAlign w:val="center"/>
+            <w:tcBorders>
+              <w:top w:val="dashed" w:sz="4" w:color="8C8C8C"/>
+              <w:left w:val="dashed" w:sz="4" w:color="8C8C8C"/>
+              <w:bottom w:val="dashed" w:sz="4" w:color="8C8C8C"/>
+              <w:right w:val="dashed" w:sz="4" w:color="8C8C8C"/>
+            </w:tcBorders>
+          </w:tcPr>
+          <w:p>
+            <w:pPr>
+              <w:spacing w:after="0" w:line="20" w:lineRule="exact"/>
+            </w:pPr>
+            <w:r>
+              <w:rPr>
+                <w:sz w:val="2"/>
+              </w:rPr>
+            </w:r>
+          </w:p>
+          <w:tbl>
+            <w:tblPr>
+              <w:tblW w:type="auto" w:w="0"/>
+              <w:tblLayout w:type="fixed"/>
+              <w:tblLook w:firstColumn="1" w:firstRow="1" w:lastColumn="0" w:lastRow="0" w:noHBand="0" w:noVBand="1" w:val="04A0"/>
+            </w:tblPr>
+            <w:tblGrid>
+              <w:gridCol w:w="1584"/>
+              <w:gridCol w:w="3024"/>
+            </w:tblGrid>
+            <w:tr>
+              <w:tc>
+                <w:tcPr>
+                  <w:tcW w:type="dxa" w:w="1584"/>
+                  <w:vAlign w:val="center"/>
+                </w:tcPr>
+                <w:p>
+                  <w:pPr>
+                    <w:spacing w:after="40"/>
+                  </w:pPr>
+                  <w:r>
+                    <w:drawing>
+                      <wp:inline xmlns:a="http://schemas.openxmlformats.org/drawingml/2006/main" xmlns:pic="http://schemas.openxmlformats.org/drawingml/2006/picture">
+                        <wp:extent cx="868680" cy="488892"/>
+                        <wp:docPr id="13" name="Picture 13" descr="Иллюстрация по теме карточки"/>
+                        <wp:cNvGraphicFramePr>
+                          <a:graphicFrameLocks noChangeAspect="1"/>
+                        </wp:cNvGraphicFramePr>
+                        <a:graphic>
+                          <a:graphicData uri="http://schemas.openxmlformats.org/drawingml/2006/picture">
+                            <pic:pic>
+                              <pic:nvPicPr>
+                                <pic:cNvPr id="0" name="04.jpg"/>
+                                <pic:cNvPicPr/>
+                              </pic:nvPicPr>
+                              <pic:blipFill>
+                                <a:blip r:embed="rId13"/>
+                                <a:stretch>
+                                  <a:fillRect/>
+                                </a:stretch>
+                              </pic:blipFill>
+                              <pic:spPr>
+                                <a:xfrm>
+                                  <a:off x="0" y="0"/>
+                                  <a:ext cx="868680" cy="488892"/>
+                                </a:xfrm>
+                                <a:prstGeom prst="rect"/>
+                              </pic:spPr>
+                            </pic:pic>
+                          </a:graphicData>
+                        </a:graphic>
+                      </wp:inline>
+                    </w:drawing>
+                  </w:r>
+                </w:p>
+              </w:tc>
+              <w:tc>
+                <w:tcPr>
+                  <w:tcW w:type="dxa" w:w="3024"/>
+                  <w:vAlign w:val="center"/>
+                </w:tcPr>
+                <w:p>
+                  <w:pPr>
+                    <w:spacing w:after="40" w:line="240" w:lineRule="auto"/>
+                  </w:pPr>
+                  <w:r>
+                    <w:rPr>
+                      <w:sz w:val="28"/>
+                    </w:rPr>
+                    <w:t>Я умею слушать</w:t>
+                  </w:r>
+                </w:p>
+              </w:tc>
+            </w:tr>
+          </w:tbl>
+          <w:p>
+            <w:pPr>
+              <w:spacing w:after="0" w:line="20" w:lineRule="exact"/>
+            </w:pPr>
+            <w:r>
+              <w:rPr>
+                <w:sz w:val="2"/>
+              </w:rPr>
+            </w:r>
+          </w:p>
+        </w:tc>
+      </w:tr>
+    </w:tbl>
     <w:p>
       <w:pPr>
         <w:pStyle w:val="Heading2"/>
@@ -303,29 +1601,17 @@
     </w:p>
     <w:p>
       <w:r>
-        <w:t>В обоих стихах подчеркните одинаковые слова о верности. Суммы, доверенные слугам, были разными.</w:t>
+        <w:t>Подчеркните одинаковые слова о верности. Суммы, доверенные слугам, были разными.</w:t>
       </w:r>
     </w:p>
     <w:p>
       <w:r>
-        <w:rPr>
-          <w:b/>
-        </w:rPr>
-        <w:t xml:space="preserve">Мф. 25:21: </w:t>
-      </w:r>
-      <w:r>
-        <w:t>Господин его сказал ему: «хорошо, добрый и верный раб! в малом ты был верен, над многим тебя поставлю; войди в радость господина твоего».</w:t>
+        <w:t>Мф. 25:21: Господин его сказал ему: «хорошо, добрый и верный раб! в малом ты был верен, над многим тебя поставлю; войди в радость господина твоего».</w:t>
       </w:r>
     </w:p>
     <w:p>
       <w:r>
-        <w:rPr>
-          <w:b/>
-        </w:rPr>
-        <w:t xml:space="preserve">Мф. 25:23: </w:t>
-      </w:r>
-      <w:r>
-        <w:t>Господин его сказал ему: «хорошо, добрый и верный раб! в малом ты был верен, над многим тебя поставлю; войди в радость господина твоего».</w:t>
+        <w:t>Мф. 25:23: Господин его сказал ему: «хорошо, добрый и верный раб! в малом ты был верен, над многим тебя поставлю; войди в радость господина твоего».</w:t>
       </w:r>
     </w:p>
     <w:p>
@@ -356,81 +1642,677 @@
     </w:p>
     <w:p>
       <w:r>
-        <w:t>Вырежьте шесть карточек возможностей. Можно добавить своё умение. Каждый выбирает доступный вклад в общее дело.</w:t>
+        <w:t>Вырежьте шесть карточек. Можно добавить своё умение. Каждый выбирает доступный вклад в общее дело.</w:t>
       </w:r>
     </w:p>
-    <w:p>
-      <w:pPr>
-        <w:spacing w:before="160"/>
-      </w:pPr>
-      <w:r>
-        <w:rPr>
-          <w:b/>
-          <w:sz w:val="36"/>
-        </w:rPr>
-        <w:t>Понятно объясняю</w:t>
-      </w:r>
-    </w:p>
-    <w:p>
-      <w:pPr>
-        <w:spacing w:before="160"/>
-      </w:pPr>
-      <w:r>
-        <w:rPr>
-          <w:b/>
-          <w:sz w:val="36"/>
-        </w:rPr>
-        <w:t>Рисую или оформляю</w:t>
-      </w:r>
-    </w:p>
-    <w:p>
-      <w:pPr>
-        <w:spacing w:before="160"/>
-      </w:pPr>
-      <w:r>
-        <w:rPr>
-          <w:b/>
-          <w:sz w:val="36"/>
-        </w:rPr>
-        <w:t>Внимательно слушаю</w:t>
-      </w:r>
-    </w:p>
-    <w:p>
-      <w:pPr>
-        <w:spacing w:before="160"/>
-      </w:pPr>
-      <w:r>
-        <w:rPr>
-          <w:b/>
-          <w:sz w:val="36"/>
-        </w:rPr>
-        <w:t>Замечаю детали</w:t>
-      </w:r>
-    </w:p>
-    <w:p>
-      <w:pPr>
-        <w:spacing w:before="160"/>
-      </w:pPr>
-      <w:r>
-        <w:rPr>
-          <w:b/>
-          <w:sz w:val="36"/>
-        </w:rPr>
-        <w:t>Могу организовать</w:t>
-      </w:r>
-    </w:p>
-    <w:p>
-      <w:pPr>
-        <w:spacing w:before="160"/>
-      </w:pPr>
-      <w:r>
-        <w:rPr>
-          <w:b/>
-          <w:sz w:val="36"/>
-        </w:rPr>
-        <w:t>Хочу учиться</w:t>
-      </w:r>
-    </w:p>
+    <w:tbl>
+      <w:tblPr>
+        <w:tblW w:type="auto" w:w="0"/>
+        <w:tblLayout w:type="fixed"/>
+        <w:tblLook w:firstColumn="1" w:firstRow="1" w:lastColumn="0" w:lastRow="0" w:noHBand="0" w:noVBand="1" w:val="04A0"/>
+      </w:tblPr>
+      <w:tblGrid>
+        <w:gridCol w:w="5040"/>
+        <w:gridCol w:w="5040"/>
+      </w:tblGrid>
+      <w:tr>
+        <w:trPr>
+          <w:cantSplit/>
+        </w:trPr>
+        <w:tc>
+          <w:tcPr>
+            <w:tcW w:type="dxa" w:w="5040"/>
+            <w:vAlign w:val="center"/>
+            <w:tcBorders>
+              <w:top w:val="dashed" w:sz="4" w:color="8C8C8C"/>
+              <w:left w:val="dashed" w:sz="4" w:color="8C8C8C"/>
+              <w:bottom w:val="dashed" w:sz="4" w:color="8C8C8C"/>
+              <w:right w:val="dashed" w:sz="4" w:color="8C8C8C"/>
+            </w:tcBorders>
+          </w:tcPr>
+          <w:p>
+            <w:pPr>
+              <w:spacing w:after="0" w:line="20" w:lineRule="exact"/>
+            </w:pPr>
+            <w:r>
+              <w:rPr>
+                <w:sz w:val="2"/>
+              </w:rPr>
+            </w:r>
+          </w:p>
+          <w:tbl>
+            <w:tblPr>
+              <w:tblW w:type="auto" w:w="0"/>
+              <w:tblLayout w:type="fixed"/>
+              <w:tblLook w:firstColumn="1" w:firstRow="1" w:lastColumn="0" w:lastRow="0" w:noHBand="0" w:noVBand="1" w:val="04A0"/>
+            </w:tblPr>
+            <w:tblGrid>
+              <w:gridCol w:w="1584"/>
+              <w:gridCol w:w="3024"/>
+            </w:tblGrid>
+            <w:tr>
+              <w:tc>
+                <w:tcPr>
+                  <w:tcW w:type="dxa" w:w="1584"/>
+                  <w:vAlign w:val="center"/>
+                </w:tcPr>
+                <w:p>
+                  <w:pPr>
+                    <w:spacing w:after="40"/>
+                  </w:pPr>
+                  <w:r>
+                    <w:drawing>
+                      <wp:inline xmlns:a="http://schemas.openxmlformats.org/drawingml/2006/main" xmlns:pic="http://schemas.openxmlformats.org/drawingml/2006/picture">
+                        <wp:extent cx="868680" cy="488892"/>
+                        <wp:docPr id="14" name="Picture 14" descr="Иллюстрация по теме карточки"/>
+                        <wp:cNvGraphicFramePr>
+                          <a:graphicFrameLocks noChangeAspect="1"/>
+                        </wp:cNvGraphicFramePr>
+                        <a:graphic>
+                          <a:graphicData uri="http://schemas.openxmlformats.org/drawingml/2006/picture">
+                            <pic:pic>
+                              <pic:nvPicPr>
+                                <pic:cNvPr id="0" name="04.jpg"/>
+                                <pic:cNvPicPr/>
+                              </pic:nvPicPr>
+                              <pic:blipFill>
+                                <a:blip r:embed="rId13"/>
+                                <a:stretch>
+                                  <a:fillRect/>
+                                </a:stretch>
+                              </pic:blipFill>
+                              <pic:spPr>
+                                <a:xfrm>
+                                  <a:off x="0" y="0"/>
+                                  <a:ext cx="868680" cy="488892"/>
+                                </a:xfrm>
+                                <a:prstGeom prst="rect"/>
+                              </pic:spPr>
+                            </pic:pic>
+                          </a:graphicData>
+                        </a:graphic>
+                      </wp:inline>
+                    </w:drawing>
+                  </w:r>
+                </w:p>
+              </w:tc>
+              <w:tc>
+                <w:tcPr>
+                  <w:tcW w:type="dxa" w:w="3024"/>
+                  <w:vAlign w:val="center"/>
+                </w:tcPr>
+                <w:p>
+                  <w:pPr>
+                    <w:spacing w:after="40" w:line="240" w:lineRule="auto"/>
+                  </w:pPr>
+                  <w:r>
+                    <w:rPr>
+                      <w:sz w:val="28"/>
+                    </w:rPr>
+                    <w:t>Понятно объясняю</w:t>
+                  </w:r>
+                </w:p>
+              </w:tc>
+            </w:tr>
+          </w:tbl>
+          <w:p>
+            <w:pPr>
+              <w:spacing w:after="0" w:line="20" w:lineRule="exact"/>
+            </w:pPr>
+            <w:r>
+              <w:rPr>
+                <w:sz w:val="2"/>
+              </w:rPr>
+            </w:r>
+          </w:p>
+        </w:tc>
+        <w:tc>
+          <w:tcPr>
+            <w:tcW w:type="dxa" w:w="5040"/>
+            <w:vAlign w:val="center"/>
+            <w:tcBorders>
+              <w:top w:val="dashed" w:sz="4" w:color="8C8C8C"/>
+              <w:left w:val="dashed" w:sz="4" w:color="8C8C8C"/>
+              <w:bottom w:val="dashed" w:sz="4" w:color="8C8C8C"/>
+              <w:right w:val="dashed" w:sz="4" w:color="8C8C8C"/>
+            </w:tcBorders>
+          </w:tcPr>
+          <w:p>
+            <w:pPr>
+              <w:spacing w:after="0" w:line="20" w:lineRule="exact"/>
+            </w:pPr>
+            <w:r>
+              <w:rPr>
+                <w:sz w:val="2"/>
+              </w:rPr>
+            </w:r>
+          </w:p>
+          <w:tbl>
+            <w:tblPr>
+              <w:tblW w:type="auto" w:w="0"/>
+              <w:tblLayout w:type="fixed"/>
+              <w:tblLook w:firstColumn="1" w:firstRow="1" w:lastColumn="0" w:lastRow="0" w:noHBand="0" w:noVBand="1" w:val="04A0"/>
+            </w:tblPr>
+            <w:tblGrid>
+              <w:gridCol w:w="1584"/>
+              <w:gridCol w:w="3024"/>
+            </w:tblGrid>
+            <w:tr>
+              <w:tc>
+                <w:tcPr>
+                  <w:tcW w:type="dxa" w:w="1584"/>
+                  <w:vAlign w:val="center"/>
+                </w:tcPr>
+                <w:p>
+                  <w:pPr>
+                    <w:spacing w:after="40"/>
+                  </w:pPr>
+                  <w:r>
+                    <w:drawing>
+                      <wp:inline xmlns:a="http://schemas.openxmlformats.org/drawingml/2006/main" xmlns:pic="http://schemas.openxmlformats.org/drawingml/2006/picture">
+                        <wp:extent cx="868680" cy="488892"/>
+                        <wp:docPr id="15" name="Picture 15" descr="Иллюстрация по теме карточки"/>
+                        <wp:cNvGraphicFramePr>
+                          <a:graphicFrameLocks noChangeAspect="1"/>
+                        </wp:cNvGraphicFramePr>
+                        <a:graphic>
+                          <a:graphicData uri="http://schemas.openxmlformats.org/drawingml/2006/picture">
+                            <pic:pic>
+                              <pic:nvPicPr>
+                                <pic:cNvPr id="0" name="01.jpg"/>
+                                <pic:cNvPicPr/>
+                              </pic:nvPicPr>
+                              <pic:blipFill>
+                                <a:blip r:embed="rId10"/>
+                                <a:stretch>
+                                  <a:fillRect/>
+                                </a:stretch>
+                              </pic:blipFill>
+                              <pic:spPr>
+                                <a:xfrm>
+                                  <a:off x="0" y="0"/>
+                                  <a:ext cx="868680" cy="488892"/>
+                                </a:xfrm>
+                                <a:prstGeom prst="rect"/>
+                              </pic:spPr>
+                            </pic:pic>
+                          </a:graphicData>
+                        </a:graphic>
+                      </wp:inline>
+                    </w:drawing>
+                  </w:r>
+                </w:p>
+              </w:tc>
+              <w:tc>
+                <w:tcPr>
+                  <w:tcW w:type="dxa" w:w="3024"/>
+                  <w:vAlign w:val="center"/>
+                </w:tcPr>
+                <w:p>
+                  <w:pPr>
+                    <w:spacing w:after="40" w:line="240" w:lineRule="auto"/>
+                  </w:pPr>
+                  <w:r>
+                    <w:rPr>
+                      <w:sz w:val="28"/>
+                    </w:rPr>
+                    <w:t>Рисую или оформляю</w:t>
+                  </w:r>
+                </w:p>
+              </w:tc>
+            </w:tr>
+          </w:tbl>
+          <w:p>
+            <w:pPr>
+              <w:spacing w:after="0" w:line="20" w:lineRule="exact"/>
+            </w:pPr>
+            <w:r>
+              <w:rPr>
+                <w:sz w:val="2"/>
+              </w:rPr>
+            </w:r>
+          </w:p>
+        </w:tc>
+      </w:tr>
+      <w:tr>
+        <w:trPr>
+          <w:cantSplit/>
+        </w:trPr>
+        <w:tc>
+          <w:tcPr>
+            <w:tcW w:type="dxa" w:w="5040"/>
+            <w:vAlign w:val="center"/>
+            <w:tcBorders>
+              <w:top w:val="dashed" w:sz="4" w:color="8C8C8C"/>
+              <w:left w:val="dashed" w:sz="4" w:color="8C8C8C"/>
+              <w:bottom w:val="dashed" w:sz="4" w:color="8C8C8C"/>
+              <w:right w:val="dashed" w:sz="4" w:color="8C8C8C"/>
+            </w:tcBorders>
+          </w:tcPr>
+          <w:p>
+            <w:pPr>
+              <w:spacing w:after="0" w:line="20" w:lineRule="exact"/>
+            </w:pPr>
+            <w:r>
+              <w:rPr>
+                <w:sz w:val="2"/>
+              </w:rPr>
+            </w:r>
+          </w:p>
+          <w:tbl>
+            <w:tblPr>
+              <w:tblW w:type="auto" w:w="0"/>
+              <w:tblLayout w:type="fixed"/>
+              <w:tblLook w:firstColumn="1" w:firstRow="1" w:lastColumn="0" w:lastRow="0" w:noHBand="0" w:noVBand="1" w:val="04A0"/>
+            </w:tblPr>
+            <w:tblGrid>
+              <w:gridCol w:w="1584"/>
+              <w:gridCol w:w="3024"/>
+            </w:tblGrid>
+            <w:tr>
+              <w:tc>
+                <w:tcPr>
+                  <w:tcW w:type="dxa" w:w="1584"/>
+                  <w:vAlign w:val="center"/>
+                </w:tcPr>
+                <w:p>
+                  <w:pPr>
+                    <w:spacing w:after="40"/>
+                  </w:pPr>
+                  <w:r>
+                    <w:drawing>
+                      <wp:inline xmlns:a="http://schemas.openxmlformats.org/drawingml/2006/main" xmlns:pic="http://schemas.openxmlformats.org/drawingml/2006/picture">
+                        <wp:extent cx="868680" cy="488892"/>
+                        <wp:docPr id="16" name="Picture 16" descr="Иллюстрация по теме карточки"/>
+                        <wp:cNvGraphicFramePr>
+                          <a:graphicFrameLocks noChangeAspect="1"/>
+                        </wp:cNvGraphicFramePr>
+                        <a:graphic>
+                          <a:graphicData uri="http://schemas.openxmlformats.org/drawingml/2006/picture">
+                            <pic:pic>
+                              <pic:nvPicPr>
+                                <pic:cNvPr id="0" name="04.jpg"/>
+                                <pic:cNvPicPr/>
+                              </pic:nvPicPr>
+                              <pic:blipFill>
+                                <a:blip r:embed="rId13"/>
+                                <a:stretch>
+                                  <a:fillRect/>
+                                </a:stretch>
+                              </pic:blipFill>
+                              <pic:spPr>
+                                <a:xfrm>
+                                  <a:off x="0" y="0"/>
+                                  <a:ext cx="868680" cy="488892"/>
+                                </a:xfrm>
+                                <a:prstGeom prst="rect"/>
+                              </pic:spPr>
+                            </pic:pic>
+                          </a:graphicData>
+                        </a:graphic>
+                      </wp:inline>
+                    </w:drawing>
+                  </w:r>
+                </w:p>
+              </w:tc>
+              <w:tc>
+                <w:tcPr>
+                  <w:tcW w:type="dxa" w:w="3024"/>
+                  <w:vAlign w:val="center"/>
+                </w:tcPr>
+                <w:p>
+                  <w:pPr>
+                    <w:spacing w:after="40" w:line="240" w:lineRule="auto"/>
+                  </w:pPr>
+                  <w:r>
+                    <w:rPr>
+                      <w:sz w:val="28"/>
+                    </w:rPr>
+                    <w:t>Внимательно слушаю</w:t>
+                  </w:r>
+                </w:p>
+              </w:tc>
+            </w:tr>
+          </w:tbl>
+          <w:p>
+            <w:pPr>
+              <w:spacing w:after="0" w:line="20" w:lineRule="exact"/>
+            </w:pPr>
+            <w:r>
+              <w:rPr>
+                <w:sz w:val="2"/>
+              </w:rPr>
+            </w:r>
+          </w:p>
+        </w:tc>
+        <w:tc>
+          <w:tcPr>
+            <w:tcW w:type="dxa" w:w="5040"/>
+            <w:vAlign w:val="center"/>
+            <w:tcBorders>
+              <w:top w:val="dashed" w:sz="4" w:color="8C8C8C"/>
+              <w:left w:val="dashed" w:sz="4" w:color="8C8C8C"/>
+              <w:bottom w:val="dashed" w:sz="4" w:color="8C8C8C"/>
+              <w:right w:val="dashed" w:sz="4" w:color="8C8C8C"/>
+            </w:tcBorders>
+          </w:tcPr>
+          <w:p>
+            <w:pPr>
+              <w:spacing w:after="0" w:line="20" w:lineRule="exact"/>
+            </w:pPr>
+            <w:r>
+              <w:rPr>
+                <w:sz w:val="2"/>
+              </w:rPr>
+            </w:r>
+          </w:p>
+          <w:tbl>
+            <w:tblPr>
+              <w:tblW w:type="auto" w:w="0"/>
+              <w:tblLayout w:type="fixed"/>
+              <w:tblLook w:firstColumn="1" w:firstRow="1" w:lastColumn="0" w:lastRow="0" w:noHBand="0" w:noVBand="1" w:val="04A0"/>
+            </w:tblPr>
+            <w:tblGrid>
+              <w:gridCol w:w="1584"/>
+              <w:gridCol w:w="3024"/>
+            </w:tblGrid>
+            <w:tr>
+              <w:tc>
+                <w:tcPr>
+                  <w:tcW w:type="dxa" w:w="1584"/>
+                  <w:vAlign w:val="center"/>
+                </w:tcPr>
+                <w:p>
+                  <w:pPr>
+                    <w:spacing w:after="40"/>
+                  </w:pPr>
+                  <w:r>
+                    <w:drawing>
+                      <wp:inline xmlns:a="http://schemas.openxmlformats.org/drawingml/2006/main" xmlns:pic="http://schemas.openxmlformats.org/drawingml/2006/picture">
+                        <wp:extent cx="868680" cy="488892"/>
+                        <wp:docPr id="17" name="Picture 17" descr="Иллюстрация по теме карточки"/>
+                        <wp:cNvGraphicFramePr>
+                          <a:graphicFrameLocks noChangeAspect="1"/>
+                        </wp:cNvGraphicFramePr>
+                        <a:graphic>
+                          <a:graphicData uri="http://schemas.openxmlformats.org/drawingml/2006/picture">
+                            <pic:pic>
+                              <pic:nvPicPr>
+                                <pic:cNvPr id="0" name="01.jpg"/>
+                                <pic:cNvPicPr/>
+                              </pic:nvPicPr>
+                              <pic:blipFill>
+                                <a:blip r:embed="rId10"/>
+                                <a:stretch>
+                                  <a:fillRect/>
+                                </a:stretch>
+                              </pic:blipFill>
+                              <pic:spPr>
+                                <a:xfrm>
+                                  <a:off x="0" y="0"/>
+                                  <a:ext cx="868680" cy="488892"/>
+                                </a:xfrm>
+                                <a:prstGeom prst="rect"/>
+                              </pic:spPr>
+                            </pic:pic>
+                          </a:graphicData>
+                        </a:graphic>
+                      </wp:inline>
+                    </w:drawing>
+                  </w:r>
+                </w:p>
+              </w:tc>
+              <w:tc>
+                <w:tcPr>
+                  <w:tcW w:type="dxa" w:w="3024"/>
+                  <w:vAlign w:val="center"/>
+                </w:tcPr>
+                <w:p>
+                  <w:pPr>
+                    <w:spacing w:after="40" w:line="240" w:lineRule="auto"/>
+                  </w:pPr>
+                  <w:r>
+                    <w:rPr>
+                      <w:sz w:val="28"/>
+                    </w:rPr>
+                    <w:t>Замечаю детали</w:t>
+                  </w:r>
+                </w:p>
+              </w:tc>
+            </w:tr>
+          </w:tbl>
+          <w:p>
+            <w:pPr>
+              <w:spacing w:after="0" w:line="20" w:lineRule="exact"/>
+            </w:pPr>
+            <w:r>
+              <w:rPr>
+                <w:sz w:val="2"/>
+              </w:rPr>
+            </w:r>
+          </w:p>
+        </w:tc>
+      </w:tr>
+      <w:tr>
+        <w:trPr>
+          <w:cantSplit/>
+        </w:trPr>
+        <w:tc>
+          <w:tcPr>
+            <w:tcW w:type="dxa" w:w="5040"/>
+            <w:vAlign w:val="center"/>
+            <w:tcBorders>
+              <w:top w:val="dashed" w:sz="4" w:color="8C8C8C"/>
+              <w:left w:val="dashed" w:sz="4" w:color="8C8C8C"/>
+              <w:bottom w:val="dashed" w:sz="4" w:color="8C8C8C"/>
+              <w:right w:val="dashed" w:sz="4" w:color="8C8C8C"/>
+            </w:tcBorders>
+          </w:tcPr>
+          <w:p>
+            <w:pPr>
+              <w:spacing w:after="0" w:line="20" w:lineRule="exact"/>
+            </w:pPr>
+            <w:r>
+              <w:rPr>
+                <w:sz w:val="2"/>
+              </w:rPr>
+            </w:r>
+          </w:p>
+          <w:tbl>
+            <w:tblPr>
+              <w:tblW w:type="auto" w:w="0"/>
+              <w:tblLayout w:type="fixed"/>
+              <w:tblLook w:firstColumn="1" w:firstRow="1" w:lastColumn="0" w:lastRow="0" w:noHBand="0" w:noVBand="1" w:val="04A0"/>
+            </w:tblPr>
+            <w:tblGrid>
+              <w:gridCol w:w="1584"/>
+              <w:gridCol w:w="3024"/>
+            </w:tblGrid>
+            <w:tr>
+              <w:tc>
+                <w:tcPr>
+                  <w:tcW w:type="dxa" w:w="1584"/>
+                  <w:vAlign w:val="center"/>
+                </w:tcPr>
+                <w:p>
+                  <w:pPr>
+                    <w:spacing w:after="40"/>
+                  </w:pPr>
+                  <w:r>
+                    <w:drawing>
+                      <wp:inline xmlns:a="http://schemas.openxmlformats.org/drawingml/2006/main" xmlns:pic="http://schemas.openxmlformats.org/drawingml/2006/picture">
+                        <wp:extent cx="868680" cy="488892"/>
+                        <wp:docPr id="18" name="Picture 18" descr="Иллюстрация по теме карточки"/>
+                        <wp:cNvGraphicFramePr>
+                          <a:graphicFrameLocks noChangeAspect="1"/>
+                        </wp:cNvGraphicFramePr>
+                        <a:graphic>
+                          <a:graphicData uri="http://schemas.openxmlformats.org/drawingml/2006/picture">
+                            <pic:pic>
+                              <pic:nvPicPr>
+                                <pic:cNvPr id="0" name="04.jpg"/>
+                                <pic:cNvPicPr/>
+                              </pic:nvPicPr>
+                              <pic:blipFill>
+                                <a:blip r:embed="rId13"/>
+                                <a:stretch>
+                                  <a:fillRect/>
+                                </a:stretch>
+                              </pic:blipFill>
+                              <pic:spPr>
+                                <a:xfrm>
+                                  <a:off x="0" y="0"/>
+                                  <a:ext cx="868680" cy="488892"/>
+                                </a:xfrm>
+                                <a:prstGeom prst="rect"/>
+                              </pic:spPr>
+                            </pic:pic>
+                          </a:graphicData>
+                        </a:graphic>
+                      </wp:inline>
+                    </w:drawing>
+                  </w:r>
+                </w:p>
+              </w:tc>
+              <w:tc>
+                <w:tcPr>
+                  <w:tcW w:type="dxa" w:w="3024"/>
+                  <w:vAlign w:val="center"/>
+                </w:tcPr>
+                <w:p>
+                  <w:pPr>
+                    <w:spacing w:after="40" w:line="240" w:lineRule="auto"/>
+                  </w:pPr>
+                  <w:r>
+                    <w:rPr>
+                      <w:sz w:val="28"/>
+                    </w:rPr>
+                    <w:t>Могу организовать</w:t>
+                  </w:r>
+                </w:p>
+              </w:tc>
+            </w:tr>
+          </w:tbl>
+          <w:p>
+            <w:pPr>
+              <w:spacing w:after="0" w:line="20" w:lineRule="exact"/>
+            </w:pPr>
+            <w:r>
+              <w:rPr>
+                <w:sz w:val="2"/>
+              </w:rPr>
+            </w:r>
+          </w:p>
+        </w:tc>
+        <w:tc>
+          <w:tcPr>
+            <w:tcW w:type="dxa" w:w="5040"/>
+            <w:vAlign w:val="center"/>
+            <w:tcBorders>
+              <w:top w:val="dashed" w:sz="4" w:color="8C8C8C"/>
+              <w:left w:val="dashed" w:sz="4" w:color="8C8C8C"/>
+              <w:bottom w:val="dashed" w:sz="4" w:color="8C8C8C"/>
+              <w:right w:val="dashed" w:sz="4" w:color="8C8C8C"/>
+            </w:tcBorders>
+          </w:tcPr>
+          <w:p>
+            <w:pPr>
+              <w:spacing w:after="0" w:line="20" w:lineRule="exact"/>
+            </w:pPr>
+            <w:r>
+              <w:rPr>
+                <w:sz w:val="2"/>
+              </w:rPr>
+            </w:r>
+          </w:p>
+          <w:tbl>
+            <w:tblPr>
+              <w:tblW w:type="auto" w:w="0"/>
+              <w:tblLayout w:type="fixed"/>
+              <w:tblLook w:firstColumn="1" w:firstRow="1" w:lastColumn="0" w:lastRow="0" w:noHBand="0" w:noVBand="1" w:val="04A0"/>
+            </w:tblPr>
+            <w:tblGrid>
+              <w:gridCol w:w="1584"/>
+              <w:gridCol w:w="3024"/>
+            </w:tblGrid>
+            <w:tr>
+              <w:tc>
+                <w:tcPr>
+                  <w:tcW w:type="dxa" w:w="1584"/>
+                  <w:vAlign w:val="center"/>
+                </w:tcPr>
+                <w:p>
+                  <w:pPr>
+                    <w:spacing w:after="40"/>
+                  </w:pPr>
+                  <w:r>
+                    <w:drawing>
+                      <wp:inline xmlns:a="http://schemas.openxmlformats.org/drawingml/2006/main" xmlns:pic="http://schemas.openxmlformats.org/drawingml/2006/picture">
+                        <wp:extent cx="868680" cy="488892"/>
+                        <wp:docPr id="19" name="Picture 19" descr="Иллюстрация по теме карточки"/>
+                        <wp:cNvGraphicFramePr>
+                          <a:graphicFrameLocks noChangeAspect="1"/>
+                        </wp:cNvGraphicFramePr>
+                        <a:graphic>
+                          <a:graphicData uri="http://schemas.openxmlformats.org/drawingml/2006/picture">
+                            <pic:pic>
+                              <pic:nvPicPr>
+                                <pic:cNvPr id="0" name="01.jpg"/>
+                                <pic:cNvPicPr/>
+                              </pic:nvPicPr>
+                              <pic:blipFill>
+                                <a:blip r:embed="rId10"/>
+                                <a:stretch>
+                                  <a:fillRect/>
+                                </a:stretch>
+                              </pic:blipFill>
+                              <pic:spPr>
+                                <a:xfrm>
+                                  <a:off x="0" y="0"/>
+                                  <a:ext cx="868680" cy="488892"/>
+                                </a:xfrm>
+                                <a:prstGeom prst="rect"/>
+                              </pic:spPr>
+                            </pic:pic>
+                          </a:graphicData>
+                        </a:graphic>
+                      </wp:inline>
+                    </w:drawing>
+                  </w:r>
+                </w:p>
+              </w:tc>
+              <w:tc>
+                <w:tcPr>
+                  <w:tcW w:type="dxa" w:w="3024"/>
+                  <w:vAlign w:val="center"/>
+                </w:tcPr>
+                <w:p>
+                  <w:pPr>
+                    <w:spacing w:after="40" w:line="240" w:lineRule="auto"/>
+                  </w:pPr>
+                  <w:r>
+                    <w:rPr>
+                      <w:sz w:val="28"/>
+                    </w:rPr>
+                    <w:t>Хочу учиться</w:t>
+                  </w:r>
+                </w:p>
+              </w:tc>
+            </w:tr>
+          </w:tbl>
+          <w:p>
+            <w:pPr>
+              <w:spacing w:after="0" w:line="20" w:lineRule="exact"/>
+            </w:pPr>
+            <w:r>
+              <w:rPr>
+                <w:sz w:val="2"/>
+              </w:rPr>
+            </w:r>
+          </w:p>
+        </w:tc>
+      </w:tr>
+    </w:tbl>
     <w:p>
       <w:pPr>
         <w:pStyle w:val="Heading2"/>
@@ -439,19 +2321,86 @@
         <w:t>Мастерская помощи: 6 минут</w:t>
       </w:r>
     </w:p>
+    <w:tbl>
+      <w:tblPr>
+        <w:tblW w:type="auto" w:w="0"/>
+        <w:tblLayout w:type="fixed"/>
+        <w:tblLook w:firstColumn="1" w:firstRow="1" w:lastColumn="0" w:lastRow="0" w:noHBand="0" w:noVBand="1" w:val="04A0"/>
+      </w:tblPr>
+      <w:tblGrid>
+        <w:gridCol w:w="2016"/>
+        <w:gridCol w:w="8064"/>
+      </w:tblGrid>
+      <w:tr>
+        <w:trPr>
+          <w:cantSplit/>
+        </w:trPr>
+        <w:tc>
+          <w:tcPr>
+            <w:tcW w:type="dxa" w:w="2016"/>
+            <w:vAlign w:val="center"/>
+          </w:tcPr>
+          <w:p>
+            <w:pPr>
+              <w:spacing w:after="40"/>
+            </w:pPr>
+            <w:r>
+              <w:drawing>
+                <wp:inline xmlns:a="http://schemas.openxmlformats.org/drawingml/2006/main" xmlns:pic="http://schemas.openxmlformats.org/drawingml/2006/picture">
+                  <wp:extent cx="1097280" cy="617548"/>
+                  <wp:docPr id="20" name="Picture 20" descr="Команда готовит помощь"/>
+                  <wp:cNvGraphicFramePr>
+                    <a:graphicFrameLocks noChangeAspect="1"/>
+                  </wp:cNvGraphicFramePr>
+                  <a:graphic>
+                    <a:graphicData uri="http://schemas.openxmlformats.org/drawingml/2006/picture">
+                      <pic:pic>
+                        <pic:nvPicPr>
+                          <pic:cNvPr id="0" name="05.jpg"/>
+                          <pic:cNvPicPr/>
+                        </pic:nvPicPr>
+                        <pic:blipFill>
+                          <a:blip r:embed="rId14"/>
+                          <a:stretch>
+                            <a:fillRect/>
+                          </a:stretch>
+                        </pic:blipFill>
+                        <pic:spPr>
+                          <a:xfrm>
+                            <a:off x="0" y="0"/>
+                            <a:ext cx="1097280" cy="617548"/>
+                          </a:xfrm>
+                          <a:prstGeom prst="rect"/>
+                        </pic:spPr>
+                      </pic:pic>
+                    </a:graphicData>
+                  </a:graphic>
+                </wp:inline>
+              </w:drawing>
+            </w:r>
+          </w:p>
+        </w:tc>
+        <w:tc>
+          <w:tcPr>
+            <w:tcW w:type="dxa" w:w="8064"/>
+            <w:vAlign w:val="center"/>
+          </w:tcPr>
+          <w:p>
+            <w:r>
+              <w:t>Новичок просит объяснить, как присоединиться к игре. Выберите простую знакомую игру. Сделайте приглашение с названием и двумя первыми шагами. Подготовьте приветствие на 30 секунд.</w:t>
+            </w:r>
+          </w:p>
+        </w:tc>
+      </w:tr>
+    </w:tbl>
     <w:p>
       <w:r>
-        <w:t>Новичок просит объяснить, как присоединиться к вашей общей игре. Выберите простую знакомую игру. Сделайте приглашение с названием и двумя первыми шагами. Подготовьте приветствие на 30 секунд.</w:t>
+        <w:t>Роли: встретить; объяснить; оформить; проверить понятность. В команде из трёх участников две роли можно совместить.</w:t>
       </w:r>
     </w:p>
     <w:p>
       <w:r>
-        <w:t>Возможные роли: встретить; объяснить; оформить; проверить понятность. В команде из трёх участников две роли можно совместить.</w:t>
-      </w:r>
-    </w:p>
-    <w:p>
-      <w:r>
-        <w:t>Время: 1 мин — задача и роли; 4 мин — изготовление; 1 мин — репетиция. Учитель поможет выбрать посильный вариант.</w:t>
+        <w:t>1 мин — задача и роли; 4 мин — изготовление; 1 мин — репетиция. Учитель поможет выбрать посильный вариант.</w:t>
       </w:r>
     </w:p>
     <w:p>
@@ -464,41 +2413,251 @@
         <w:pStyle w:val="Heading1"/>
       </w:pPr>
       <w:r>
-        <w:t>Вопрос, ответ и проверка помощи</w:t>
+        <w:t>Вопрос ответ и проверка помощи</w:t>
       </w:r>
     </w:p>
     <w:p>
       <w:r>
-        <w:t>Для этапа 7: один участник — помощник, другой выбирает одну карточку новичка. Через минуту поменяйтесь ролями.</w:t>
+        <w:t>Этап 7: один — помощник, другой выбирает карточку новичка. Через минуту поменяйтесь ролями.</w:t>
       </w:r>
     </w:p>
-    <w:p>
-      <w:pPr>
-        <w:spacing w:before="280"/>
-      </w:pPr>
-      <w:r>
-        <w:rPr>
-          <w:b/>
-          <w:sz w:val="34"/>
-        </w:rPr>
-        <w:t>НОВИЧОК: Хочу понять правила игры.</w:t>
-      </w:r>
-    </w:p>
-    <w:p>
-      <w:pPr>
-        <w:spacing w:before="280"/>
-      </w:pPr>
-      <w:r>
-        <w:rPr>
-          <w:b/>
-          <w:sz w:val="34"/>
-        </w:rPr>
-        <w:t>НОВИЧОК: Хочу познакомиться с ребятами.</w:t>
-      </w:r>
-    </w:p>
+    <w:tbl>
+      <w:tblPr>
+        <w:tblW w:type="auto" w:w="0"/>
+        <w:tblLayout w:type="fixed"/>
+        <w:tblLook w:firstColumn="1" w:firstRow="1" w:lastColumn="0" w:lastRow="0" w:noHBand="0" w:noVBand="1" w:val="04A0"/>
+      </w:tblPr>
+      <w:tblGrid>
+        <w:gridCol w:w="5040"/>
+        <w:gridCol w:w="5040"/>
+      </w:tblGrid>
+      <w:tr>
+        <w:trPr>
+          <w:cantSplit/>
+        </w:trPr>
+        <w:tc>
+          <w:tcPr>
+            <w:tcW w:type="dxa" w:w="5040"/>
+            <w:vAlign w:val="center"/>
+            <w:tcBorders>
+              <w:top w:val="dashed" w:sz="4" w:color="8C8C8C"/>
+              <w:left w:val="dashed" w:sz="4" w:color="8C8C8C"/>
+              <w:bottom w:val="dashed" w:sz="4" w:color="8C8C8C"/>
+              <w:right w:val="dashed" w:sz="4" w:color="8C8C8C"/>
+            </w:tcBorders>
+          </w:tcPr>
+          <w:p>
+            <w:pPr>
+              <w:spacing w:after="0" w:line="20" w:lineRule="exact"/>
+            </w:pPr>
+            <w:r>
+              <w:rPr>
+                <w:sz w:val="2"/>
+              </w:rPr>
+            </w:r>
+          </w:p>
+          <w:tbl>
+            <w:tblPr>
+              <w:tblW w:type="auto" w:w="0"/>
+              <w:tblLayout w:type="fixed"/>
+              <w:tblLook w:firstColumn="1" w:firstRow="1" w:lastColumn="0" w:lastRow="0" w:noHBand="0" w:noVBand="1" w:val="04A0"/>
+            </w:tblPr>
+            <w:tblGrid>
+              <w:gridCol w:w="1584"/>
+              <w:gridCol w:w="3024"/>
+            </w:tblGrid>
+            <w:tr>
+              <w:tc>
+                <w:tcPr>
+                  <w:tcW w:type="dxa" w:w="1584"/>
+                  <w:vAlign w:val="center"/>
+                </w:tcPr>
+                <w:p>
+                  <w:pPr>
+                    <w:spacing w:after="40"/>
+                  </w:pPr>
+                  <w:r>
+                    <w:drawing>
+                      <wp:inline xmlns:a="http://schemas.openxmlformats.org/drawingml/2006/main" xmlns:pic="http://schemas.openxmlformats.org/drawingml/2006/picture">
+                        <wp:extent cx="868680" cy="488892"/>
+                        <wp:docPr id="21" name="Picture 21" descr="Иллюстрация по теме карточки"/>
+                        <wp:cNvGraphicFramePr>
+                          <a:graphicFrameLocks noChangeAspect="1"/>
+                        </wp:cNvGraphicFramePr>
+                        <a:graphic>
+                          <a:graphicData uri="http://schemas.openxmlformats.org/drawingml/2006/picture">
+                            <pic:pic>
+                              <pic:nvPicPr>
+                                <pic:cNvPr id="0" name="04.jpg"/>
+                                <pic:cNvPicPr/>
+                              </pic:nvPicPr>
+                              <pic:blipFill>
+                                <a:blip r:embed="rId13"/>
+                                <a:stretch>
+                                  <a:fillRect/>
+                                </a:stretch>
+                              </pic:blipFill>
+                              <pic:spPr>
+                                <a:xfrm>
+                                  <a:off x="0" y="0"/>
+                                  <a:ext cx="868680" cy="488892"/>
+                                </a:xfrm>
+                                <a:prstGeom prst="rect"/>
+                              </pic:spPr>
+                            </pic:pic>
+                          </a:graphicData>
+                        </a:graphic>
+                      </wp:inline>
+                    </w:drawing>
+                  </w:r>
+                </w:p>
+              </w:tc>
+              <w:tc>
+                <w:tcPr>
+                  <w:tcW w:type="dxa" w:w="3024"/>
+                  <w:vAlign w:val="center"/>
+                </w:tcPr>
+                <w:p>
+                  <w:pPr>
+                    <w:spacing w:after="40" w:line="240" w:lineRule="auto"/>
+                  </w:pPr>
+                  <w:r>
+                    <w:rPr>
+                      <w:sz w:val="28"/>
+                    </w:rPr>
+                    <w:t>НОВИЧОК</w:t>
+                    <w:br/>
+                    <w:t>Хочу понять правила игры.</w:t>
+                  </w:r>
+                </w:p>
+              </w:tc>
+            </w:tr>
+          </w:tbl>
+          <w:p>
+            <w:pPr>
+              <w:spacing w:after="0" w:line="20" w:lineRule="exact"/>
+            </w:pPr>
+            <w:r>
+              <w:rPr>
+                <w:sz w:val="2"/>
+              </w:rPr>
+            </w:r>
+          </w:p>
+        </w:tc>
+        <w:tc>
+          <w:tcPr>
+            <w:tcW w:type="dxa" w:w="5040"/>
+            <w:vAlign w:val="center"/>
+            <w:tcBorders>
+              <w:top w:val="dashed" w:sz="4" w:color="8C8C8C"/>
+              <w:left w:val="dashed" w:sz="4" w:color="8C8C8C"/>
+              <w:bottom w:val="dashed" w:sz="4" w:color="8C8C8C"/>
+              <w:right w:val="dashed" w:sz="4" w:color="8C8C8C"/>
+            </w:tcBorders>
+          </w:tcPr>
+          <w:p>
+            <w:pPr>
+              <w:spacing w:after="0" w:line="20" w:lineRule="exact"/>
+            </w:pPr>
+            <w:r>
+              <w:rPr>
+                <w:sz w:val="2"/>
+              </w:rPr>
+            </w:r>
+          </w:p>
+          <w:tbl>
+            <w:tblPr>
+              <w:tblW w:type="auto" w:w="0"/>
+              <w:tblLayout w:type="fixed"/>
+              <w:tblLook w:firstColumn="1" w:firstRow="1" w:lastColumn="0" w:lastRow="0" w:noHBand="0" w:noVBand="1" w:val="04A0"/>
+            </w:tblPr>
+            <w:tblGrid>
+              <w:gridCol w:w="1584"/>
+              <w:gridCol w:w="3024"/>
+            </w:tblGrid>
+            <w:tr>
+              <w:tc>
+                <w:tcPr>
+                  <w:tcW w:type="dxa" w:w="1584"/>
+                  <w:vAlign w:val="center"/>
+                </w:tcPr>
+                <w:p>
+                  <w:pPr>
+                    <w:spacing w:after="40"/>
+                  </w:pPr>
+                  <w:r>
+                    <w:drawing>
+                      <wp:inline xmlns:a="http://schemas.openxmlformats.org/drawingml/2006/main" xmlns:pic="http://schemas.openxmlformats.org/drawingml/2006/picture">
+                        <wp:extent cx="868680" cy="488892"/>
+                        <wp:docPr id="22" name="Picture 22" descr="Иллюстрация по теме карточки"/>
+                        <wp:cNvGraphicFramePr>
+                          <a:graphicFrameLocks noChangeAspect="1"/>
+                        </wp:cNvGraphicFramePr>
+                        <a:graphic>
+                          <a:graphicData uri="http://schemas.openxmlformats.org/drawingml/2006/picture">
+                            <pic:pic>
+                              <pic:nvPicPr>
+                                <pic:cNvPr id="0" name="04.jpg"/>
+                                <pic:cNvPicPr/>
+                              </pic:nvPicPr>
+                              <pic:blipFill>
+                                <a:blip r:embed="rId13"/>
+                                <a:stretch>
+                                  <a:fillRect/>
+                                </a:stretch>
+                              </pic:blipFill>
+                              <pic:spPr>
+                                <a:xfrm>
+                                  <a:off x="0" y="0"/>
+                                  <a:ext cx="868680" cy="488892"/>
+                                </a:xfrm>
+                                <a:prstGeom prst="rect"/>
+                              </pic:spPr>
+                            </pic:pic>
+                          </a:graphicData>
+                        </a:graphic>
+                      </wp:inline>
+                    </w:drawing>
+                  </w:r>
+                </w:p>
+              </w:tc>
+              <w:tc>
+                <w:tcPr>
+                  <w:tcW w:type="dxa" w:w="3024"/>
+                  <w:vAlign w:val="center"/>
+                </w:tcPr>
+                <w:p>
+                  <w:pPr>
+                    <w:spacing w:after="40" w:line="240" w:lineRule="auto"/>
+                  </w:pPr>
+                  <w:r>
+                    <w:rPr>
+                      <w:sz w:val="28"/>
+                    </w:rPr>
+                    <w:t>НОВИЧОК</w:t>
+                    <w:br/>
+                    <w:t>Хочу познакомиться с ребятами.</w:t>
+                  </w:r>
+                </w:p>
+              </w:tc>
+            </w:tr>
+          </w:tbl>
+          <w:p>
+            <w:pPr>
+              <w:spacing w:after="0" w:line="20" w:lineRule="exact"/>
+            </w:pPr>
+            <w:r>
+              <w:rPr>
+                <w:sz w:val="2"/>
+              </w:rPr>
+            </w:r>
+          </w:p>
+        </w:tc>
+      </w:tr>
+    </w:tbl>
     <w:p>
       <w:r>
-        <w:t>Помощник спрашивает: «Что поможет тебе присоединиться?» После ответа предлагает одно действие.</w:t>
+        <w:t>Помощник спрашивает: «Что поможет тебе присоединиться?» После ответа предлагает действие.</w:t>
       </w:r>
     </w:p>
     <w:p>

</xml_diff>